<commit_message>
Documentation capteur particules et tests unitaires
</commit_message>
<xml_diff>
--- a/Dossier_perso_ROUSSEAU_Mateo_MaraisRSense.docx
+++ b/Dossier_perso_ROUSSEAU_Mateo_MaraisRSense.docx
@@ -28,13 +28,8 @@
       </w:r>
       <w:r>
         <w:rPr>
-          <w:rFonts w:ascii="Arial" w:hAnsi="Arial" w:eastAsia="Arial" w:cs="Arial"/>
-          <w:b/>
-          <w:bCs/>
-          <w:color w:val="1f3864"/>
-          <w:sz w:val="96"/>
-          <w:szCs w:val="96"/>
-          <w:highlight w:val="none"/>
+          <w:sz w:val="28"/>
+          <w:szCs w:val="28"/>
           <w:lang w:val="fr-FR"/>
         </w:rPr>
       </w:r>
@@ -167,13 +162,6 @@
       </w:r>
       <w:r>
         <w:rPr>
-          <w:sz w:val="28"/>
-          <w:szCs w:val="28"/>
-          <w:lang w:val="fr-FR"/>
-        </w:rPr>
-      </w:r>
-      <w:r>
-        <w:rPr>
           <w:rFonts w:ascii="Arial" w:hAnsi="Arial" w:eastAsia="Arial" w:cs="Arial"/>
           <w:b/>
           <w:bCs/>
@@ -184,6 +172,18 @@
           <w:lang w:val="fr-FR"/>
         </w:rPr>
       </w:r>
+      <w:r>
+        <w:rPr>
+          <w:rFonts w:ascii="Arial" w:hAnsi="Arial" w:eastAsia="Arial" w:cs="Arial"/>
+          <w:b/>
+          <w:bCs/>
+          <w:color w:val="1f3864"/>
+          <w:sz w:val="96"/>
+          <w:szCs w:val="96"/>
+          <w:highlight w:val="none"/>
+          <w:lang w:val="fr-FR"/>
+        </w:rPr>
+      </w:r>
     </w:p>
     <w:p>
       <w:pPr>
@@ -221,6 +221,7 @@
       </w:r>
       <w:r>
         <w:rPr>
+          <w:highlight w:val="none"/>
           <w:lang w:val="fr-FR"/>
         </w:rPr>
       </w:r>
@@ -783,7 +784,6 @@
       </w:r>
       <w:r>
         <w:rPr>
-          <w:highlight w:val="none"/>
           <w:lang w:val="fr-FR"/>
         </w:rPr>
       </w:r>
@@ -1399,7 +1399,7 @@
     </w:p>
     <w:p>
       <w:pPr>
-        <w:pStyle w:val="918"/>
+        <w:pStyle w:val="919"/>
         <w:pBdr/>
         <w:spacing/>
         <w:ind/>
@@ -1516,7 +1516,7 @@
     </w:p>
     <w:p>
       <w:pPr>
-        <w:pStyle w:val="918"/>
+        <w:pStyle w:val="919"/>
         <w:pBdr/>
         <w:spacing/>
         <w:ind/>
@@ -1544,7 +1544,7 @@
     </w:p>
     <w:p>
       <w:pPr>
-        <w:pStyle w:val="919"/>
+        <w:pStyle w:val="920"/>
         <w:pBdr/>
         <w:spacing/>
         <w:ind/>
@@ -1639,30 +1639,35 @@
       </w:r>
       <w:r>
         <w:rPr>
+          <w:lang w:val="fr-FR"/>
+        </w:rPr>
+      </w:r>
+      <w:r>
+        <w:rPr>
+          <w:lang w:val="fr-FR"/>
+        </w:rPr>
+      </w:r>
+    </w:p>
+    <w:p>
+      <w:pPr>
+        <w:pBdr/>
+        <w:spacing w:after="120" w:before="0"/>
+        <w:ind/>
+        <w:jc w:val="both"/>
+        <w:rPr>
+          <w:highlight w:val="none"/>
+          <w:lang w:val="fr-FR"/>
+        </w:rPr>
+      </w:pPr>
+      <w:r>
+        <w:rPr>
           <w:rFonts w:ascii="Arial" w:hAnsi="Arial" w:eastAsia="Arial" w:cs="Arial"/>
           <w:sz w:val="22"/>
           <w:szCs w:val="22"/>
-          <w:highlight w:val="none"/>
-          <w:lang w:val="fr-FR"/>
-        </w:rPr>
-      </w:r>
-      <w:r>
-        <w:rPr>
-          <w:lang w:val="fr-FR"/>
-        </w:rPr>
-      </w:r>
-    </w:p>
-    <w:p>
-      <w:pPr>
-        <w:pBdr/>
-        <w:spacing w:after="120" w:before="0"/>
-        <w:ind/>
-        <w:jc w:val="both"/>
-        <w:rPr>
-          <w:highlight w:val="none"/>
-          <w:lang w:val="fr-FR"/>
-        </w:rPr>
-      </w:pPr>
+          <w:lang w:val="fr-FR"/>
+        </w:rPr>
+        <w:t xml:space="preserve">La sonde sur laquelle j’interviens sera </w:t>
+      </w:r>
       <w:r>
         <w:rPr>
           <w:rFonts w:ascii="Arial" w:hAnsi="Arial" w:eastAsia="Arial" w:cs="Arial"/>
@@ -1670,19 +1675,11 @@
           <w:szCs w:val="22"/>
           <w:lang w:val="fr-FR"/>
         </w:rPr>
-        <w:t xml:space="preserve">La sonde sur laquelle j’interviens sera </w:t>
-      </w:r>
-      <w:r>
-        <w:rPr>
-          <w:rFonts w:ascii="Arial" w:hAnsi="Arial" w:eastAsia="Arial" w:cs="Arial"/>
-          <w:sz w:val="22"/>
-          <w:szCs w:val="22"/>
-          <w:lang w:val="fr-FR"/>
-        </w:rPr>
         <w:t xml:space="preserve">déployée à proximité des machines de coupe dans l'atelier principal. Mon travail couvre le logiciel embarqué de cette sonde (couches Model, View et Controller du principe MVC).</w:t>
       </w:r>
       <w:r>
         <w:rPr>
+          <w:highlight w:val="none"/>
           <w:lang w:val="fr-FR"/>
         </w:rPr>
       </w:r>
@@ -1710,6 +1707,12 @@
           <w:lang w:val="fr-FR" w:bidi="fr-FR"/>
         </w:rPr>
         <w:t xml:space="preserve">Diagramme de déploiement :</w:t>
+      </w:r>
+      <w:r>
+        <w:rPr>
+          <w:highlight w:val="none"/>
+          <w:lang w:val="fr-FR"/>
+        </w:rPr>
       </w:r>
       <w:r>
         <w:rPr>
@@ -1810,108 +1813,105 @@
       <w:r>
         <w:rPr>
           <w:highlight w:val="none"/>
-          <w:lang w:val="fr-FR" w:bidi="fr-FR"/>
-        </w:rPr>
-      </w:r>
-      <w:r>
-        <w:rPr>
-          <w:highlight w:val="none"/>
-          <w:lang w:val="fr-FR" w:bidi="fr-FR"/>
-        </w:rPr>
-      </w:r>
-      <w:r>
-        <w:rPr>
-          <w:highlight w:val="none"/>
-          <w:lang w:val="fr-FR"/>
-        </w:rPr>
-      </w:r>
-    </w:p>
-    <w:p>
-      <w:pPr>
-        <w:pBdr/>
-        <w:spacing w:after="200"/>
-        <w:ind/>
-        <w:rPr>
-          <w:lang w:val="fr-FR"/>
-        </w:rPr>
-      </w:pPr>
-      <w:r>
-        <w:rPr>
-          <w:lang w:val="fr-FR" w:bidi="fr-FR"/>
-        </w:rPr>
-      </w:r>
-      <w:r>
-        <w:rPr>
-          <w:lang w:val="fr-FR"/>
-        </w:rPr>
-      </w:r>
-      <w:r>
-        <w:rPr>
-          <w:lang w:val="fr-FR"/>
-        </w:rPr>
-      </w:r>
-    </w:p>
-    <w:p>
-      <w:pPr>
-        <w:pStyle w:val="919"/>
-        <w:pBdr/>
-        <w:spacing/>
-        <w:ind/>
-        <w:rPr>
-          <w:lang w:val="fr-FR"/>
-        </w:rPr>
-      </w:pPr>
-      <w:r>
-        <w:rPr>
-          <w:rFonts w:ascii="Arial" w:hAnsi="Arial" w:eastAsia="Arial" w:cs="Arial"/>
-          <w:lang w:val="fr-FR"/>
-        </w:rPr>
-        <w:t xml:space="preserve">1.2 – Description de la partie personnelle</w:t>
-      </w:r>
-      <w:r>
-        <w:rPr>
-          <w:lang w:val="fr-FR"/>
-        </w:rPr>
-      </w:r>
-      <w:r>
-        <w:rPr>
-          <w:lang w:val="fr-FR"/>
-        </w:rPr>
-      </w:r>
-    </w:p>
-    <w:p>
-      <w:pPr>
-        <w:pBdr/>
-        <w:spacing w:after="120" w:before="0"/>
-        <w:ind/>
-        <w:jc w:val="both"/>
-        <w:rPr>
-          <w:lang w:val="fr-FR"/>
-        </w:rPr>
-      </w:pPr>
+          <w:lang w:val="fr-FR"/>
+        </w:rPr>
+      </w:r>
       <w:r>
         <w:rPr>
           <w:rFonts w:ascii="Arial" w:hAnsi="Arial" w:eastAsia="Arial" w:cs="Arial"/>
           <w:sz w:val="22"/>
           <w:szCs w:val="22"/>
-          <w:lang w:val="fr-FR"/>
-        </w:rPr>
-        <w:t xml:space="preserve">Les objectifs de ma réalisation sont les suivants :</w:t>
-      </w:r>
-      <w:r>
-        <w:rPr>
-          <w:lang w:val="fr-FR"/>
-        </w:rPr>
-      </w:r>
-      <w:r>
-        <w:rPr>
+          <w:highlight w:val="none"/>
           <w:lang w:val="fr-FR"/>
         </w:rPr>
       </w:r>
     </w:p>
     <w:p>
       <w:pPr>
-        <w:pStyle w:val="910"/>
+        <w:pBdr/>
+        <w:spacing w:after="200"/>
+        <w:ind/>
+        <w:rPr>
+          <w:lang w:val="fr-FR"/>
+        </w:rPr>
+      </w:pPr>
+      <w:r>
+        <w:rPr>
+          <w:lang w:val="fr-FR" w:bidi="fr-FR"/>
+        </w:rPr>
+      </w:r>
+      <w:r>
+        <w:rPr>
+          <w:lang w:val="fr-FR"/>
+        </w:rPr>
+      </w:r>
+      <w:r>
+        <w:rPr>
+          <w:lang w:val="fr-FR"/>
+        </w:rPr>
+      </w:r>
+    </w:p>
+    <w:p>
+      <w:pPr>
+        <w:pStyle w:val="920"/>
+        <w:pBdr/>
+        <w:spacing/>
+        <w:ind/>
+        <w:rPr>
+          <w:lang w:val="fr-FR"/>
+        </w:rPr>
+      </w:pPr>
+      <w:r>
+        <w:rPr>
+          <w:rFonts w:ascii="Arial" w:hAnsi="Arial" w:eastAsia="Arial" w:cs="Arial"/>
+          <w:lang w:val="fr-FR"/>
+        </w:rPr>
+        <w:t xml:space="preserve">1.2 – Description de la partie personnelle</w:t>
+      </w:r>
+      <w:r>
+        <w:rPr>
+          <w:lang w:val="fr-FR"/>
+        </w:rPr>
+      </w:r>
+      <w:r>
+        <w:rPr>
+          <w:lang w:val="fr-FR"/>
+        </w:rPr>
+      </w:r>
+    </w:p>
+    <w:p>
+      <w:pPr>
+        <w:pBdr/>
+        <w:spacing w:after="120" w:before="0"/>
+        <w:ind/>
+        <w:jc w:val="both"/>
+        <w:rPr>
+          <w:lang w:val="fr-FR"/>
+        </w:rPr>
+      </w:pPr>
+      <w:r>
+        <w:rPr>
+          <w:rFonts w:ascii="Arial" w:hAnsi="Arial" w:eastAsia="Arial" w:cs="Arial"/>
+          <w:sz w:val="22"/>
+          <w:szCs w:val="22"/>
+          <w:lang w:val="fr-FR"/>
+        </w:rPr>
+        <w:t xml:space="preserve">Les objectifs de ma réalisation sont les suivants :</w:t>
+      </w:r>
+      <w:r>
+        <w:rPr>
+          <w:lang w:val="fr-FR"/>
+        </w:rPr>
+      </w:r>
+      <w:r>
+        <w:rPr>
+          <w:lang w:val="fr-FR"/>
+        </w:rPr>
+      </w:r>
+    </w:p>
+    <w:p>
+      <w:pPr>
+        <w:pStyle w:val="911"/>
         <w:numPr>
           <w:ilvl w:val="0"/>
           <w:numId w:val="2"/>
@@ -1945,7 +1945,7 @@
     </w:p>
     <w:p>
       <w:pPr>
-        <w:pStyle w:val="910"/>
+        <w:pStyle w:val="911"/>
         <w:numPr>
           <w:ilvl w:val="0"/>
           <w:numId w:val="2"/>
@@ -1979,7 +1979,7 @@
     </w:p>
     <w:p>
       <w:pPr>
-        <w:pStyle w:val="910"/>
+        <w:pStyle w:val="911"/>
         <w:numPr>
           <w:ilvl w:val="0"/>
           <w:numId w:val="2"/>
@@ -2013,7 +2013,7 @@
     </w:p>
     <w:p>
       <w:pPr>
-        <w:pStyle w:val="910"/>
+        <w:pStyle w:val="911"/>
         <w:numPr>
           <w:ilvl w:val="0"/>
           <w:numId w:val="2"/>
@@ -2047,7 +2047,7 @@
     </w:p>
     <w:p>
       <w:pPr>
-        <w:pStyle w:val="910"/>
+        <w:pStyle w:val="911"/>
         <w:numPr>
           <w:ilvl w:val="0"/>
           <w:numId w:val="2"/>
@@ -2081,7 +2081,7 @@
     </w:p>
     <w:p>
       <w:pPr>
-        <w:pStyle w:val="910"/>
+        <w:pStyle w:val="911"/>
         <w:numPr>
           <w:ilvl w:val="0"/>
           <w:numId w:val="2"/>
@@ -2121,7 +2121,7 @@
     </w:p>
     <w:p>
       <w:pPr>
-        <w:pStyle w:val="918"/>
+        <w:pStyle w:val="919"/>
         <w:pBdr/>
         <w:spacing/>
         <w:ind/>
@@ -2149,7 +2149,7 @@
     </w:p>
     <w:p>
       <w:pPr>
-        <w:pStyle w:val="919"/>
+        <w:pStyle w:val="920"/>
         <w:pBdr/>
         <w:spacing/>
         <w:ind/>
@@ -2177,7 +2177,7 @@
     </w:p>
     <w:p>
       <w:pPr>
-        <w:pStyle w:val="920"/>
+        <w:pStyle w:val="921"/>
         <w:pBdr/>
         <w:spacing/>
         <w:ind/>
@@ -2313,7 +2313,7 @@
     </w:p>
     <w:p>
       <w:pPr>
-        <w:pStyle w:val="910"/>
+        <w:pStyle w:val="911"/>
         <w:numPr>
           <w:ilvl w:val="0"/>
           <w:numId w:val="2"/>
@@ -2347,7 +2347,7 @@
     </w:p>
     <w:p>
       <w:pPr>
-        <w:pStyle w:val="910"/>
+        <w:pStyle w:val="911"/>
         <w:numPr>
           <w:ilvl w:val="0"/>
           <w:numId w:val="2"/>
@@ -2406,7 +2406,7 @@
     </w:p>
     <w:p>
       <w:pPr>
-        <w:pStyle w:val="920"/>
+        <w:pStyle w:val="921"/>
         <w:pBdr/>
         <w:spacing/>
         <w:ind/>
@@ -2793,25 +2793,30 @@
       </w:r>
       <w:r>
         <w:rPr>
+          <w:lang w:val="fr-FR"/>
+        </w:rPr>
+      </w:r>
+      <w:r>
+        <w:rPr>
+          <w:lang w:val="fr-FR"/>
+        </w:rPr>
+      </w:r>
+    </w:p>
+    <w:p>
+      <w:pPr>
+        <w:pBdr/>
+        <w:spacing w:after="120" w:before="0"/>
+        <w:ind/>
+        <w:jc w:val="both"/>
+        <w:rPr>
           <w:rFonts w:ascii="Arial" w:hAnsi="Arial" w:eastAsia="Arial" w:cs="Arial"/>
           <w:sz w:val="22"/>
           <w:szCs w:val="22"/>
           <w:highlight w:val="none"/>
           <w:lang w:val="fr-FR"/>
         </w:rPr>
-      </w:r>
-      <w:r>
-        <w:rPr>
-          <w:lang w:val="fr-FR"/>
-        </w:rPr>
-      </w:r>
-    </w:p>
-    <w:p>
-      <w:pPr>
-        <w:pBdr/>
-        <w:spacing w:after="120" w:before="0"/>
-        <w:ind/>
-        <w:jc w:val="both"/>
+      </w:pPr>
+      <w:r>
         <w:rPr>
           <w:rFonts w:ascii="Arial" w:hAnsi="Arial" w:eastAsia="Arial" w:cs="Arial"/>
           <w:sz w:val="22"/>
@@ -2819,7 +2824,7 @@
           <w:highlight w:val="none"/>
           <w:lang w:val="fr-FR"/>
         </w:rPr>
-      </w:pPr>
+      </w:r>
       <w:r>
         <w:rPr>
           <w:rFonts w:ascii="Arial" w:hAnsi="Arial" w:eastAsia="Arial" w:cs="Arial"/>
@@ -2838,7 +2843,13 @@
           <w:lang w:val="fr-FR"/>
         </w:rPr>
       </w:r>
-      <w:r>
+    </w:p>
+    <w:p>
+      <w:pPr>
+        <w:pBdr/>
+        <w:spacing w:after="120" w:before="0"/>
+        <w:ind/>
+        <w:jc w:val="both"/>
         <w:rPr>
           <w:rFonts w:ascii="Arial" w:hAnsi="Arial" w:eastAsia="Arial" w:cs="Arial"/>
           <w:sz w:val="22"/>
@@ -2846,14 +2857,17 @@
           <w:highlight w:val="none"/>
           <w:lang w:val="fr-FR"/>
         </w:rPr>
-      </w:r>
-    </w:p>
-    <w:p>
-      <w:pPr>
-        <w:pBdr/>
-        <w:spacing w:after="120" w:before="0"/>
-        <w:ind/>
-        <w:jc w:val="both"/>
+      </w:pPr>
+      <w:r>
+        <w:rPr>
+          <w:rFonts w:ascii="Arial" w:hAnsi="Arial" w:eastAsia="Arial" w:cs="Arial"/>
+          <w:sz w:val="22"/>
+          <w:szCs w:val="22"/>
+          <w:lang w:val="fr-FR"/>
+        </w:rPr>
+        <w:t xml:space="preserve">Description des méthodes principales :</w:t>
+      </w:r>
+      <w:r>
         <w:rPr>
           <w:rFonts w:ascii="Arial" w:hAnsi="Arial" w:eastAsia="Arial" w:cs="Arial"/>
           <w:sz w:val="22"/>
@@ -2861,20 +2875,6 @@
           <w:highlight w:val="none"/>
           <w:lang w:val="fr-FR"/>
         </w:rPr>
-      </w:pPr>
-      <w:r>
-        <w:rPr>
-          <w:rFonts w:ascii="Arial" w:hAnsi="Arial" w:eastAsia="Arial" w:cs="Arial"/>
-          <w:sz w:val="22"/>
-          <w:szCs w:val="22"/>
-          <w:lang w:val="fr-FR"/>
-        </w:rPr>
-        <w:t xml:space="preserve">Description des méthodes principales :</w:t>
-      </w:r>
-      <w:r>
-        <w:rPr>
-          <w:lang w:val="fr-FR"/>
-        </w:rPr>
       </w:r>
       <w:r>
         <w:rPr>
@@ -2888,7 +2888,7 @@
     </w:p>
     <w:p>
       <w:pPr>
-        <w:pStyle w:val="910"/>
+        <w:pStyle w:val="911"/>
         <w:numPr>
           <w:ilvl w:val="0"/>
           <w:numId w:val="2"/>
@@ -2942,7 +2942,7 @@
     </w:p>
     <w:p>
       <w:pPr>
-        <w:pStyle w:val="910"/>
+        <w:pStyle w:val="911"/>
         <w:numPr>
           <w:ilvl w:val="0"/>
           <w:numId w:val="2"/>
@@ -3046,7 +3046,7 @@
     </w:p>
     <w:p>
       <w:pPr>
-        <w:pStyle w:val="919"/>
+        <w:pStyle w:val="920"/>
         <w:pBdr/>
         <w:spacing/>
         <w:ind/>
@@ -3062,16 +3062,11 @@
         </w:rPr>
       </w:r>
       <w:r>
-        <w:rPr>
-          <w:rFonts w:ascii="Arial" w:hAnsi="Arial" w:eastAsia="Arial" w:cs="Arial"/>
-          <w:highlight w:val="none"/>
-          <w:lang w:val="fr-FR"/>
-        </w:rPr>
         <mc:AlternateContent>
           <mc:Choice Requires="wpg">
             <w:drawing>
               <wp:inline xmlns:wp="http://schemas.openxmlformats.org/drawingml/2006/wordprocessingDrawing" distT="0" distB="0" distL="0" distR="0">
-                <wp:extent cx="6049010" cy="5889252"/>
+                <wp:extent cx="6049010" cy="3452753"/>
                 <wp:effectExtent l="0" t="0" r="0" b="0"/>
                 <wp:docPr id="5" name=""/>
                 <wp:cNvGraphicFramePr>
@@ -3081,7 +3076,7 @@
                   <a:graphicData uri="http://schemas.openxmlformats.org/drawingml/2006/picture">
                     <pic:pic xmlns:pic="http://schemas.openxmlformats.org/drawingml/2006/picture">
                       <pic:nvPicPr>
-                        <pic:cNvPr id="562353887" name=""/>
+                        <pic:cNvPr id="583797390" name=""/>
                         <pic:cNvPicPr>
                           <a:picLocks noChangeAspect="1"/>
                         </pic:cNvPicPr>
@@ -3094,7 +3089,7 @@
                       <pic:spPr bwMode="auto">
                         <a:xfrm>
                           <a:off x="0" y="0"/>
-                          <a:ext cx="6049009" cy="5889251"/>
+                          <a:ext cx="6049009" cy="3452753"/>
                         </a:xfrm>
                         <a:prstGeom prst="rect">
                           <a:avLst/>
@@ -3127,7 +3122,7 @@
                 <v:path o:extrusionok="f" gradientshapeok="t" o:connecttype="rect"/>
                 <o:lock v:ext="edit" aspectratio="t"/>
               </v:shapetype>
-              <v:shape id="_x0000_i4" o:spid="_x0000_s4" type="#_x0000_t75" style="width:476.30pt;height:463.72pt;mso-wrap-distance-left:0.00pt;mso-wrap-distance-top:0.00pt;mso-wrap-distance-right:0.00pt;mso-wrap-distance-bottom:0.00pt;z-index:1;" stroked="false">
+              <v:shape id="_x0000_i4" o:spid="_x0000_s4" type="#_x0000_t75" style="width:476.30pt;height:271.87pt;mso-wrap-distance-left:0.00pt;mso-wrap-distance-top:0.00pt;mso-wrap-distance-right:0.00pt;mso-wrap-distance-bottom:0.00pt;z-index:1;" stroked="false">
                 <v:imagedata r:id="rId15" o:title=""/>
                 <o:lock v:ext="edit" rotation="t"/>
               </v:shape>
@@ -3144,13 +3139,25 @@
       </w:r>
       <w:r>
         <w:rPr>
+          <w:rFonts w:ascii="Arial" w:hAnsi="Arial" w:eastAsia="Arial" w:cs="Arial"/>
+          <w:highlight w:val="none"/>
+          <w:lang w:val="fr-FR"/>
+        </w:rPr>
+      </w:r>
+      <w:r>
+        <w:rPr>
+          <w:lang w:val="fr-FR"/>
+        </w:rPr>
+      </w:r>
+      <w:r>
+        <w:rPr>
           <w:lang w:val="fr-FR"/>
         </w:rPr>
       </w:r>
     </w:p>
     <w:p>
       <w:pPr>
-        <w:pStyle w:val="919"/>
+        <w:pStyle w:val="920"/>
         <w:pBdr/>
         <w:spacing/>
         <w:ind/>
@@ -3169,20 +3176,22 @@
       </w:r>
       <w:r>
         <w:rPr>
-          <w:lang w:val="fr-FR"/>
-        </w:rPr>
-      </w:r>
-      <w:r>
-        <w:rPr>
           <w:rFonts w:ascii="Arial" w:hAnsi="Arial" w:eastAsia="Arial" w:cs="Arial"/>
           <w:highlight w:val="none"/>
           <w:lang w:val="fr-FR"/>
         </w:rPr>
       </w:r>
+      <w:r>
+        <w:rPr>
+          <w:rFonts w:ascii="Arial" w:hAnsi="Arial" w:eastAsia="Arial" w:cs="Arial"/>
+          <w:highlight w:val="none"/>
+          <w:lang w:val="fr-FR"/>
+        </w:rPr>
+      </w:r>
     </w:p>
     <w:p>
       <w:pPr>
-        <w:pStyle w:val="920"/>
+        <w:pStyle w:val="921"/>
         <w:pBdr/>
         <w:spacing/>
         <w:ind/>
@@ -3279,7 +3288,7 @@
     </w:p>
     <w:p>
       <w:pPr>
-        <w:pStyle w:val="920"/>
+        <w:pStyle w:val="921"/>
         <w:pBdr/>
         <w:spacing/>
         <w:ind/>
@@ -4452,6 +4461,33 @@
           <w:lang w:val="fr-FR"/>
         </w:rPr>
       </w:r>
+      <w:r/>
+      <w:r/>
+      <w:r>
+        <w:rPr>
+          <w:lang w:val="fr-FR"/>
+        </w:rPr>
+      </w:r>
+      <w:r>
+        <w:rPr>
+          <w:lang w:val="fr-FR"/>
+        </w:rPr>
+      </w:r>
+    </w:p>
+    <w:p>
+      <w:pPr>
+        <w:pBdr/>
+        <w:spacing w:after="200"/>
+        <w:ind/>
+        <w:rPr>
+          <w:lang w:val="fr-FR"/>
+        </w:rPr>
+      </w:pPr>
+      <w:r>
+        <w:rPr>
+          <w:lang w:val="fr-FR"/>
+        </w:rPr>
+      </w:r>
       <w:r>
         <mc:AlternateContent>
           <mc:Choice Requires="wpg">
@@ -4462,7 +4498,7 @@
                   <wp:posOffset>0</wp:posOffset>
                 </wp:positionH>
                 <wp:positionV relativeFrom="paragraph">
-                  <wp:posOffset>106666</wp:posOffset>
+                  <wp:posOffset>-255964</wp:posOffset>
                 </wp:positionV>
                 <wp:extent cx="3048310" cy="2286233"/>
                 <wp:effectExtent l="0" t="0" r="0" b="0"/>
@@ -4475,7 +4511,7 @@
                   <a:graphicData uri="http://schemas.openxmlformats.org/drawingml/2006/picture">
                     <pic:pic xmlns:pic="http://schemas.openxmlformats.org/drawingml/2006/picture">
                       <pic:nvPicPr>
-                        <pic:cNvPr id="629296916" name=""/>
+                        <pic:cNvPr id="1916626328" name=""/>
                         <pic:cNvPicPr>
                           <a:picLocks noChangeAspect="1"/>
                         </pic:cNvPicPr>
@@ -4488,7 +4524,7 @@
                       <pic:spPr bwMode="auto">
                         <a:xfrm flipH="0" flipV="0">
                           <a:off x="0" y="0"/>
-                          <a:ext cx="3048310" cy="2286232"/>
+                          <a:ext cx="3048309" cy="2286231"/>
                         </a:xfrm>
                         <a:prstGeom prst="rect">
                           <a:avLst/>
@@ -4521,18 +4557,13 @@
                 <v:path o:extrusionok="f" gradientshapeok="t" o:connecttype="rect"/>
                 <o:lock v:ext="edit" aspectratio="t"/>
               </v:shapetype>
-              <v:shape id="_x0000_i5" o:spid="_x0000_s5" type="#_x0000_t75" style="position:absolute;z-index:43008;o:allowoverlap:true;o:allowincell:true;mso-position-horizontal-relative:text;margin-left:0.00pt;mso-position-horizontal:absolute;mso-position-vertical-relative:text;margin-top:8.40pt;mso-position-vertical:absolute;width:240.02pt;height:180.02pt;mso-wrap-distance-left:9.07pt;mso-wrap-distance-top:0.00pt;mso-wrap-distance-right:9.07pt;mso-wrap-distance-bottom:0.00pt;z-index:1;" stroked="false">
+              <v:shape id="_x0000_i5" o:spid="_x0000_s5" type="#_x0000_t75" style="position:absolute;z-index:43008;o:allowoverlap:true;o:allowincell:true;mso-position-horizontal-relative:text;margin-left:0.00pt;mso-position-horizontal:absolute;mso-position-vertical-relative:text;margin-top:-20.15pt;mso-position-vertical:absolute;width:240.02pt;height:180.02pt;mso-wrap-distance-left:9.07pt;mso-wrap-distance-top:0.00pt;mso-wrap-distance-right:9.07pt;mso-wrap-distance-bottom:0.00pt;z-index:1;" stroked="false">
                 <v:imagedata r:id="rId16" o:title=""/>
                 <o:lock v:ext="edit" rotation="t"/>
               </v:shape>
             </w:pict>
           </mc:Fallback>
         </mc:AlternateContent>
-      </w:r>
-      <w:r>
-        <w:rPr>
-          <w:lang w:val="fr-FR"/>
-        </w:rPr>
       </w:r>
       <w:r>
         <mc:AlternateContent>
@@ -4544,7 +4575,7 @@
                   <wp:posOffset>3048310</wp:posOffset>
                 </wp:positionH>
                 <wp:positionV relativeFrom="paragraph">
-                  <wp:posOffset>106666</wp:posOffset>
+                  <wp:posOffset>-255964</wp:posOffset>
                 </wp:positionV>
                 <wp:extent cx="3048310" cy="2286233"/>
                 <wp:effectExtent l="0" t="0" r="0" b="0"/>
@@ -4557,7 +4588,7 @@
                   <a:graphicData uri="http://schemas.openxmlformats.org/drawingml/2006/picture">
                     <pic:pic xmlns:pic="http://schemas.openxmlformats.org/drawingml/2006/picture">
                       <pic:nvPicPr>
-                        <pic:cNvPr id="1445171764" name=""/>
+                        <pic:cNvPr id="1462773148" name=""/>
                         <pic:cNvPicPr>
                           <a:picLocks noChangeAspect="1"/>
                         </pic:cNvPicPr>
@@ -4570,7 +4601,7 @@
                       <pic:spPr bwMode="auto">
                         <a:xfrm flipH="0" flipV="0">
                           <a:off x="0" y="0"/>
-                          <a:ext cx="3048310" cy="2286232"/>
+                          <a:ext cx="3048309" cy="2286231"/>
                         </a:xfrm>
                         <a:prstGeom prst="rect">
                           <a:avLst/>
@@ -4603,7 +4634,7 @@
                 <v:path o:extrusionok="f" gradientshapeok="t" o:connecttype="rect"/>
                 <o:lock v:ext="edit" aspectratio="t"/>
               </v:shapetype>
-              <v:shape id="_x0000_i6" o:spid="_x0000_s6" type="#_x0000_t75" style="position:absolute;z-index:44032;o:allowoverlap:true;o:allowincell:true;mso-position-horizontal-relative:text;margin-left:240.02pt;mso-position-horizontal:absolute;mso-position-vertical-relative:text;margin-top:8.40pt;mso-position-vertical:absolute;width:240.02pt;height:180.02pt;mso-wrap-distance-left:9.07pt;mso-wrap-distance-top:0.00pt;mso-wrap-distance-right:9.07pt;mso-wrap-distance-bottom:0.00pt;z-index:1;" stroked="false">
+              <v:shape id="_x0000_i6" o:spid="_x0000_s6" type="#_x0000_t75" style="position:absolute;z-index:44032;o:allowoverlap:true;o:allowincell:true;mso-position-horizontal-relative:text;margin-left:240.02pt;mso-position-horizontal:absolute;mso-position-vertical-relative:text;margin-top:-20.15pt;mso-position-vertical:absolute;width:240.02pt;height:180.02pt;mso-wrap-distance-left:9.07pt;mso-wrap-distance-top:0.00pt;mso-wrap-distance-right:9.07pt;mso-wrap-distance-bottom:0.00pt;z-index:1;" stroked="false">
                 <v:imagedata r:id="rId17" o:title=""/>
                 <o:lock v:ext="edit" rotation="t"/>
               </v:shape>
@@ -4611,6 +4642,7 @@
           </mc:Fallback>
         </mc:AlternateContent>
       </w:r>
+      <w:r/>
       <w:r>
         <w:rPr>
           <w:lang w:val="fr-FR"/>
@@ -4629,21 +4661,25 @@
     </w:p>
     <w:p>
       <w:pPr>
-        <w:pBdr/>
-        <w:spacing w:after="200"/>
-        <w:ind/>
-        <w:rPr>
-          <w:lang w:val="fr-FR"/>
-        </w:rPr>
-      </w:pPr>
-      <w:r>
-        <w:rPr>
-          <w:lang w:val="fr-FR"/>
-        </w:rPr>
-      </w:r>
-      <w:r/>
-      <w:r>
-        <w:rPr>
+        <w:pStyle w:val="921"/>
+        <w:pBdr/>
+        <w:spacing/>
+        <w:ind/>
+        <w:rPr>
+          <w:lang w:val="fr-FR"/>
+        </w:rPr>
+      </w:pPr>
+      <w:r>
+        <w:rPr>
+          <w:rFonts w:ascii="Arial" w:hAnsi="Arial" w:eastAsia="Arial" w:cs="Arial"/>
+          <w:highlight w:val="none"/>
+          <w:lang w:val="fr-FR"/>
+        </w:rPr>
+      </w:r>
+      <w:r>
+        <w:rPr>
+          <w:rFonts w:ascii="Arial" w:hAnsi="Arial" w:eastAsia="Arial" w:cs="Arial"/>
+          <w:highlight w:val="none"/>
           <w:lang w:val="fr-FR"/>
         </w:rPr>
       </w:r>
@@ -4655,21 +4691,16 @@
     </w:p>
     <w:p>
       <w:pPr>
-        <w:pStyle w:val="920"/>
-        <w:pBdr/>
-        <w:spacing/>
-        <w:ind/>
-        <w:rPr>
-          <w:lang w:val="fr-FR"/>
-        </w:rPr>
-      </w:pPr>
-      <w:r>
+        <w:pStyle w:val="921"/>
+        <w:pBdr/>
+        <w:spacing/>
+        <w:ind/>
         <w:rPr>
           <w:rFonts w:ascii="Arial" w:hAnsi="Arial" w:eastAsia="Arial" w:cs="Arial"/>
           <w:highlight w:val="none"/>
           <w:lang w:val="fr-FR"/>
         </w:rPr>
-      </w:r>
+      </w:pPr>
       <w:r>
         <w:rPr>
           <w:rFonts w:ascii="Arial" w:hAnsi="Arial" w:eastAsia="Arial" w:cs="Arial"/>
@@ -4684,10 +4715,17 @@
           <w:lang w:val="fr-FR"/>
         </w:rPr>
       </w:r>
+      <w:r>
+        <w:rPr>
+          <w:rFonts w:ascii="Arial" w:hAnsi="Arial" w:eastAsia="Arial" w:cs="Arial"/>
+          <w:highlight w:val="none"/>
+          <w:lang w:val="fr-FR"/>
+        </w:rPr>
+      </w:r>
     </w:p>
     <w:p>
       <w:pPr>
-        <w:pStyle w:val="920"/>
+        <w:pStyle w:val="921"/>
         <w:pBdr/>
         <w:spacing/>
         <w:ind/>
@@ -4721,7 +4759,7 @@
     </w:p>
     <w:p>
       <w:pPr>
-        <w:pStyle w:val="920"/>
+        <w:pStyle w:val="921"/>
         <w:pBdr/>
         <w:spacing/>
         <w:ind/>
@@ -4755,7 +4793,7 @@
     </w:p>
     <w:p>
       <w:pPr>
-        <w:pStyle w:val="920"/>
+        <w:pStyle w:val="921"/>
         <w:pBdr/>
         <w:spacing/>
         <w:ind/>
@@ -4789,7 +4827,7 @@
     </w:p>
     <w:p>
       <w:pPr>
-        <w:pStyle w:val="920"/>
+        <w:pStyle w:val="921"/>
         <w:pBdr/>
         <w:spacing/>
         <w:ind/>
@@ -4823,41 +4861,7 @@
     </w:p>
     <w:p>
       <w:pPr>
-        <w:pStyle w:val="920"/>
-        <w:pBdr/>
-        <w:spacing/>
-        <w:ind/>
-        <w:rPr>
-          <w:rFonts w:ascii="Arial" w:hAnsi="Arial" w:eastAsia="Arial" w:cs="Arial"/>
-          <w:highlight w:val="none"/>
-          <w:lang w:val="fr-FR"/>
-        </w:rPr>
-      </w:pPr>
-      <w:r>
-        <w:rPr>
-          <w:rFonts w:ascii="Arial" w:hAnsi="Arial" w:eastAsia="Arial" w:cs="Arial"/>
-          <w:highlight w:val="none"/>
-          <w:lang w:val="fr-FR"/>
-        </w:rPr>
-      </w:r>
-      <w:r>
-        <w:rPr>
-          <w:rFonts w:ascii="Arial" w:hAnsi="Arial" w:eastAsia="Arial" w:cs="Arial"/>
-          <w:highlight w:val="none"/>
-          <w:lang w:val="fr-FR"/>
-        </w:rPr>
-      </w:r>
-      <w:r>
-        <w:rPr>
-          <w:rFonts w:ascii="Arial" w:hAnsi="Arial" w:eastAsia="Arial" w:cs="Arial"/>
-          <w:highlight w:val="none"/>
-          <w:lang w:val="fr-FR"/>
-        </w:rPr>
-      </w:r>
-    </w:p>
-    <w:p>
-      <w:pPr>
-        <w:pStyle w:val="920"/>
+        <w:pStyle w:val="921"/>
         <w:pBdr/>
         <w:spacing/>
         <w:ind/>
@@ -4884,9 +4888,9 @@
                   <wp:posOffset>0</wp:posOffset>
                 </wp:positionH>
                 <wp:positionV relativeFrom="paragraph">
-                  <wp:posOffset>207346</wp:posOffset>
+                  <wp:posOffset>132357</wp:posOffset>
                 </wp:positionV>
-                <wp:extent cx="2861650" cy="2146237"/>
+                <wp:extent cx="3048310" cy="2286232"/>
                 <wp:effectExtent l="0" t="0" r="0" b="0"/>
                 <wp:wrapNone/>
                 <wp:docPr id="8" name=""/>
@@ -4910,7 +4914,7 @@
                       <pic:spPr bwMode="auto">
                         <a:xfrm flipH="0" flipV="0">
                           <a:off x="0" y="0"/>
-                          <a:ext cx="2861649" cy="2146237"/>
+                          <a:ext cx="3048309" cy="2286231"/>
                         </a:xfrm>
                         <a:prstGeom prst="rect">
                           <a:avLst/>
@@ -4943,20 +4947,13 @@
                 <v:path o:extrusionok="f" gradientshapeok="t" o:connecttype="rect"/>
                 <o:lock v:ext="edit" aspectratio="t"/>
               </v:shapetype>
-              <v:shape id="_x0000_i7" o:spid="_x0000_s7" type="#_x0000_t75" style="position:absolute;z-index:48128;o:allowoverlap:true;o:allowincell:true;mso-position-horizontal-relative:text;margin-left:0.00pt;mso-position-horizontal:absolute;mso-position-vertical-relative:text;margin-top:16.33pt;mso-position-vertical:absolute;width:225.33pt;height:169.00pt;mso-wrap-distance-left:9.07pt;mso-wrap-distance-top:0.00pt;mso-wrap-distance-right:9.07pt;mso-wrap-distance-bottom:0.00pt;z-index:1;" stroked="false">
+              <v:shape id="_x0000_i7" o:spid="_x0000_s7" type="#_x0000_t75" style="position:absolute;z-index:48128;o:allowoverlap:true;o:allowincell:true;mso-position-horizontal-relative:text;margin-left:0.00pt;mso-position-horizontal:absolute;mso-position-vertical-relative:text;margin-top:10.42pt;mso-position-vertical:absolute;width:240.02pt;height:180.02pt;mso-wrap-distance-left:9.07pt;mso-wrap-distance-top:0.00pt;mso-wrap-distance-right:9.07pt;mso-wrap-distance-bottom:0.00pt;z-index:1;" stroked="false">
                 <v:imagedata r:id="rId18" o:title=""/>
                 <o:lock v:ext="edit" rotation="t"/>
               </v:shape>
             </w:pict>
           </mc:Fallback>
         </mc:AlternateContent>
-      </w:r>
-      <w:r>
-        <w:rPr>
-          <w:rFonts w:ascii="Arial" w:hAnsi="Arial" w:eastAsia="Arial" w:cs="Arial"/>
-          <w:highlight w:val="none"/>
-          <w:lang w:val="fr-FR"/>
-        </w:rPr>
       </w:r>
       <w:r>
         <w:rPr>
@@ -5013,10 +5010,17 @@
           <w:lang w:val="fr-FR"/>
         </w:rPr>
       </w:r>
+      <w:r>
+        <w:rPr>
+          <w:rFonts w:ascii="Arial" w:hAnsi="Arial" w:eastAsia="Arial" w:cs="Arial"/>
+          <w:highlight w:val="none"/>
+          <w:lang w:val="fr-FR"/>
+        </w:rPr>
+      </w:r>
     </w:p>
     <w:p>
       <w:pPr>
-        <w:pStyle w:val="920"/>
+        <w:pStyle w:val="921"/>
         <w:pBdr/>
         <w:spacing/>
         <w:ind/>
@@ -5050,7 +5054,7 @@
     </w:p>
     <w:p>
       <w:pPr>
-        <w:pStyle w:val="920"/>
+        <w:pStyle w:val="921"/>
         <w:pBdr/>
         <w:spacing/>
         <w:ind/>
@@ -5084,7 +5088,7 @@
     </w:p>
     <w:p>
       <w:pPr>
-        <w:pStyle w:val="920"/>
+        <w:pStyle w:val="921"/>
         <w:pBdr/>
         <w:spacing/>
         <w:ind/>
@@ -5118,7 +5122,7 @@
     </w:p>
     <w:p>
       <w:pPr>
-        <w:pStyle w:val="920"/>
+        <w:pStyle w:val="921"/>
         <w:pBdr/>
         <w:spacing/>
         <w:ind/>
@@ -5152,7 +5156,7 @@
     </w:p>
     <w:p>
       <w:pPr>
-        <w:pStyle w:val="920"/>
+        <w:pStyle w:val="921"/>
         <w:pBdr/>
         <w:spacing/>
         <w:ind/>
@@ -5186,7 +5190,7 @@
     </w:p>
     <w:p>
       <w:pPr>
-        <w:pStyle w:val="920"/>
+        <w:pStyle w:val="921"/>
         <w:pBdr/>
         <w:spacing/>
         <w:ind/>
@@ -5220,7 +5224,7 @@
     </w:p>
     <w:p>
       <w:pPr>
-        <w:pStyle w:val="920"/>
+        <w:pStyle w:val="921"/>
         <w:pBdr/>
         <w:spacing/>
         <w:ind/>
@@ -5254,7 +5258,7 @@
     </w:p>
     <w:p>
       <w:pPr>
-        <w:pStyle w:val="920"/>
+        <w:pStyle w:val="921"/>
         <w:pBdr/>
         <w:spacing/>
         <w:ind/>
@@ -5267,18 +5271,40 @@
       <w:r>
         <w:rPr>
           <w:rFonts w:ascii="Arial" w:hAnsi="Arial" w:eastAsia="Arial" w:cs="Arial"/>
+          <w:highlight w:val="none"/>
           <w:lang w:val="fr-FR"/>
         </w:rPr>
       </w:r>
       <w:r>
         <w:rPr>
           <w:rFonts w:ascii="Arial" w:hAnsi="Arial" w:eastAsia="Arial" w:cs="Arial"/>
+          <w:highlight w:val="none"/>
           <w:lang w:val="fr-FR"/>
         </w:rPr>
       </w:r>
       <w:r>
         <w:rPr>
           <w:rFonts w:ascii="Arial" w:hAnsi="Arial" w:eastAsia="Arial" w:cs="Arial"/>
+          <w:highlight w:val="none"/>
+          <w:lang w:val="fr-FR"/>
+        </w:rPr>
+      </w:r>
+    </w:p>
+    <w:p>
+      <w:pPr>
+        <w:pStyle w:val="921"/>
+        <w:pBdr/>
+        <w:spacing/>
+        <w:ind/>
+        <w:rPr>
+          <w:rFonts w:ascii="Arial" w:hAnsi="Arial" w:eastAsia="Arial" w:cs="Arial"/>
+          <w:highlight w:val="none"/>
+          <w:lang w:val="fr-FR"/>
+        </w:rPr>
+      </w:pPr>
+      <w:r>
+        <w:rPr>
+          <w:rFonts w:ascii="Arial" w:hAnsi="Arial" w:eastAsia="Arial" w:cs="Arial"/>
           <w:lang w:val="fr-FR"/>
         </w:rPr>
         <w:t xml:space="preserve">2.2.3 – Navigation et interaction physique</w:t>
@@ -5290,6 +5316,8 @@
       </w:r>
       <w:r>
         <w:rPr>
+          <w:rFonts w:ascii="Arial" w:hAnsi="Arial" w:eastAsia="Arial" w:cs="Arial"/>
+          <w:highlight w:val="none"/>
           <w:lang w:val="fr-FR"/>
         </w:rPr>
       </w:r>
@@ -5335,7 +5363,7 @@
     </w:p>
     <w:p>
       <w:pPr>
-        <w:pStyle w:val="910"/>
+        <w:pStyle w:val="911"/>
         <w:numPr>
           <w:ilvl w:val="0"/>
           <w:numId w:val="2"/>
@@ -5369,7 +5397,7 @@
     </w:p>
     <w:p>
       <w:pPr>
-        <w:pStyle w:val="910"/>
+        <w:pStyle w:val="911"/>
         <w:numPr>
           <w:ilvl w:val="0"/>
           <w:numId w:val="2"/>
@@ -5428,6 +5456,7 @@
       </w:r>
       <w:r>
         <w:rPr>
+          <w:highlight w:val="none"/>
           <w:lang w:val="fr-FR"/>
         </w:rPr>
       </w:r>
@@ -5472,7 +5501,272 @@
         <w:rPr>
           <w:lang w:val="fr-FR"/>
         </w:rPr>
-        <w:t xml:space="preserve">Diagramme d’activite :</w:t>
+      </w:r>
+      <w:r>
+        <w:rPr>
+          <w:lang w:val="fr-FR"/>
+        </w:rPr>
+      </w:r>
+      <w:r>
+        <w:rPr>
+          <w:lang w:val="fr-FR"/>
+        </w:rPr>
+      </w:r>
+    </w:p>
+    <w:p>
+      <w:pPr>
+        <w:pBdr/>
+        <w:spacing w:after="120" w:before="0"/>
+        <w:ind/>
+        <w:jc w:val="both"/>
+        <w:rPr>
+          <w:lang w:val="fr-FR"/>
+        </w:rPr>
+      </w:pPr>
+      <w:r>
+        <w:rPr>
+          <w:lang w:val="fr-FR"/>
+        </w:rPr>
+      </w:r>
+      <w:r>
+        <w:rPr>
+          <w:lang w:val="fr-FR"/>
+        </w:rPr>
+      </w:r>
+      <w:r>
+        <w:rPr>
+          <w:lang w:val="fr-FR"/>
+        </w:rPr>
+      </w:r>
+    </w:p>
+    <w:p>
+      <w:pPr>
+        <w:pBdr/>
+        <w:spacing w:after="120" w:before="0"/>
+        <w:ind/>
+        <w:jc w:val="both"/>
+        <w:rPr>
+          <w:lang w:val="fr-FR"/>
+        </w:rPr>
+      </w:pPr>
+      <w:r>
+        <w:rPr>
+          <w:lang w:val="fr-FR"/>
+        </w:rPr>
+      </w:r>
+      <w:r>
+        <w:rPr>
+          <w:lang w:val="fr-FR"/>
+        </w:rPr>
+      </w:r>
+      <w:r>
+        <w:rPr>
+          <w:lang w:val="fr-FR"/>
+        </w:rPr>
+      </w:r>
+    </w:p>
+    <w:p>
+      <w:pPr>
+        <w:pBdr/>
+        <w:spacing w:after="120" w:before="0"/>
+        <w:ind/>
+        <w:jc w:val="both"/>
+        <w:rPr>
+          <w:lang w:val="fr-FR"/>
+        </w:rPr>
+      </w:pPr>
+      <w:r>
+        <w:rPr>
+          <w:lang w:val="fr-FR"/>
+        </w:rPr>
+      </w:r>
+      <w:r>
+        <w:rPr>
+          <w:lang w:val="fr-FR"/>
+        </w:rPr>
+      </w:r>
+      <w:r>
+        <w:rPr>
+          <w:lang w:val="fr-FR"/>
+        </w:rPr>
+      </w:r>
+    </w:p>
+    <w:p>
+      <w:pPr>
+        <w:pBdr/>
+        <w:spacing w:after="120" w:before="0"/>
+        <w:ind/>
+        <w:jc w:val="both"/>
+        <w:rPr>
+          <w:lang w:val="fr-FR"/>
+        </w:rPr>
+      </w:pPr>
+      <w:r>
+        <w:rPr>
+          <w:lang w:val="fr-FR"/>
+        </w:rPr>
+      </w:r>
+      <w:r>
+        <w:rPr>
+          <w:lang w:val="fr-FR"/>
+        </w:rPr>
+      </w:r>
+      <w:r>
+        <w:rPr>
+          <w:lang w:val="fr-FR"/>
+        </w:rPr>
+      </w:r>
+    </w:p>
+    <w:p>
+      <w:pPr>
+        <w:pBdr/>
+        <w:spacing w:after="120" w:before="0"/>
+        <w:ind/>
+        <w:jc w:val="both"/>
+        <w:rPr>
+          <w:lang w:val="fr-FR"/>
+        </w:rPr>
+      </w:pPr>
+      <w:r>
+        <w:rPr>
+          <w:lang w:val="fr-FR"/>
+        </w:rPr>
+      </w:r>
+      <w:r>
+        <w:rPr>
+          <w:lang w:val="fr-FR"/>
+        </w:rPr>
+      </w:r>
+      <w:r>
+        <w:rPr>
+          <w:lang w:val="fr-FR"/>
+        </w:rPr>
+      </w:r>
+    </w:p>
+    <w:p>
+      <w:pPr>
+        <w:pBdr/>
+        <w:spacing w:after="120" w:before="0"/>
+        <w:ind/>
+        <w:jc w:val="both"/>
+        <w:rPr>
+          <w:lang w:val="fr-FR"/>
+        </w:rPr>
+      </w:pPr>
+      <w:r>
+        <w:rPr>
+          <w:lang w:val="fr-FR"/>
+        </w:rPr>
+      </w:r>
+      <w:r>
+        <w:rPr>
+          <w:lang w:val="fr-FR"/>
+        </w:rPr>
+      </w:r>
+      <w:r>
+        <w:rPr>
+          <w:lang w:val="fr-FR"/>
+        </w:rPr>
+      </w:r>
+    </w:p>
+    <w:p>
+      <w:pPr>
+        <w:pBdr/>
+        <w:spacing w:after="120" w:before="0"/>
+        <w:ind/>
+        <w:jc w:val="both"/>
+        <w:rPr>
+          <w:lang w:val="fr-FR"/>
+        </w:rPr>
+      </w:pPr>
+      <w:r>
+        <w:rPr>
+          <w:lang w:val="fr-FR"/>
+        </w:rPr>
+      </w:r>
+      <w:r>
+        <w:rPr>
+          <w:lang w:val="fr-FR"/>
+        </w:rPr>
+      </w:r>
+      <w:r>
+        <w:rPr>
+          <w:lang w:val="fr-FR"/>
+        </w:rPr>
+      </w:r>
+    </w:p>
+    <w:p>
+      <w:pPr>
+        <w:pBdr/>
+        <w:spacing w:after="120" w:before="0"/>
+        <w:ind/>
+        <w:jc w:val="both"/>
+        <w:rPr>
+          <w:lang w:val="fr-FR"/>
+        </w:rPr>
+      </w:pPr>
+      <w:r>
+        <w:rPr>
+          <w:lang w:val="fr-FR"/>
+        </w:rPr>
+      </w:r>
+      <w:r>
+        <w:rPr>
+          <w:lang w:val="fr-FR"/>
+        </w:rPr>
+      </w:r>
+      <w:r>
+        <w:rPr>
+          <w:lang w:val="fr-FR"/>
+        </w:rPr>
+      </w:r>
+    </w:p>
+    <w:p>
+      <w:pPr>
+        <w:pBdr/>
+        <w:spacing w:after="120" w:before="0"/>
+        <w:ind/>
+        <w:jc w:val="both"/>
+        <w:rPr>
+          <w:lang w:val="fr-FR"/>
+        </w:rPr>
+      </w:pPr>
+      <w:r>
+        <w:rPr>
+          <w:lang w:val="fr-FR"/>
+        </w:rPr>
+      </w:r>
+      <w:r>
+        <w:rPr>
+          <w:lang w:val="fr-FR"/>
+        </w:rPr>
+      </w:r>
+      <w:r>
+        <w:rPr>
+          <w:lang w:val="fr-FR"/>
+        </w:rPr>
+      </w:r>
+    </w:p>
+    <w:p>
+      <w:pPr>
+        <w:pBdr/>
+        <w:spacing w:after="120" w:before="0"/>
+        <w:ind/>
+        <w:jc w:val="both"/>
+        <w:rPr>
+          <w:lang w:val="fr-FR"/>
+        </w:rPr>
+      </w:pPr>
+      <w:r>
+        <w:rPr>
+          <w:lang w:val="fr-FR"/>
+        </w:rPr>
+        <w:t xml:space="preserve">Diagramme d’activité :</w:t>
+      </w:r>
+      <w:r>
+        <w:rPr>
+          <w:lang w:val="fr-FR"/>
+        </w:rPr>
       </w:r>
       <w:r>
         <w:rPr>
@@ -5572,18 +5866,11 @@
       <w:r>
         <w:rPr>
           <w:highlight w:val="none"/>
-          <w:lang w:val="fr-FR" w:bidi="fr-FR"/>
-        </w:rPr>
-      </w:r>
-      <w:r>
-        <w:rPr>
-          <w:highlight w:val="none"/>
-          <w:lang w:val="fr-FR" w:bidi="fr-FR"/>
-        </w:rPr>
-      </w:r>
-      <w:r>
-        <w:rPr>
-          <w:highlight w:val="none"/>
+          <w:lang w:val="fr-FR"/>
+        </w:rPr>
+      </w:r>
+      <w:r>
+        <w:rPr>
           <w:lang w:val="fr-FR"/>
         </w:rPr>
       </w:r>
@@ -5615,7 +5902,7 @@
     </w:p>
     <w:p>
       <w:pPr>
-        <w:pStyle w:val="920"/>
+        <w:pStyle w:val="921"/>
         <w:pBdr/>
         <w:spacing/>
         <w:ind/>
@@ -5747,7 +6034,7 @@
     </w:p>
     <w:p>
       <w:pPr>
-        <w:pStyle w:val="919"/>
+        <w:pStyle w:val="920"/>
         <w:pBdr/>
         <w:spacing/>
         <w:ind/>
@@ -5775,7 +6062,7 @@
     </w:p>
     <w:p>
       <w:pPr>
-        <w:pStyle w:val="920"/>
+        <w:pStyle w:val="921"/>
         <w:pBdr/>
         <w:spacing/>
         <w:ind/>
@@ -5872,7 +6159,7 @@
     </w:p>
     <w:p>
       <w:pPr>
-        <w:pStyle w:val="910"/>
+        <w:pStyle w:val="911"/>
         <w:numPr>
           <w:ilvl w:val="0"/>
           <w:numId w:val="2"/>
@@ -5906,7 +6193,7 @@
     </w:p>
     <w:p>
       <w:pPr>
-        <w:pStyle w:val="910"/>
+        <w:pStyle w:val="911"/>
         <w:numPr>
           <w:ilvl w:val="0"/>
           <w:numId w:val="2"/>
@@ -5940,7 +6227,7 @@
     </w:p>
     <w:p>
       <w:pPr>
-        <w:pStyle w:val="910"/>
+        <w:pStyle w:val="911"/>
         <w:numPr>
           <w:ilvl w:val="0"/>
           <w:numId w:val="2"/>
@@ -5999,7 +6286,7 @@
     </w:p>
     <w:p>
       <w:pPr>
-        <w:pStyle w:val="920"/>
+        <w:pStyle w:val="921"/>
         <w:pBdr/>
         <w:spacing/>
         <w:ind/>
@@ -6574,7 +6861,7 @@
     </w:p>
     <w:p>
       <w:pPr>
-        <w:pStyle w:val="920"/>
+        <w:pStyle w:val="921"/>
         <w:pBdr/>
         <w:spacing/>
         <w:ind/>
@@ -6692,7 +6979,7 @@
     </w:p>
     <w:p>
       <w:pPr>
-        <w:pStyle w:val="919"/>
+        <w:pStyle w:val="920"/>
         <w:pBdr/>
         <w:spacing/>
         <w:ind/>
@@ -6720,7 +7007,7 @@
     </w:p>
     <w:p>
       <w:pPr>
-        <w:pStyle w:val="920"/>
+        <w:pStyle w:val="921"/>
         <w:pBdr/>
         <w:spacing/>
         <w:ind/>
@@ -6778,7 +7065,7 @@
     </w:p>
     <w:p>
       <w:pPr>
-        <w:pStyle w:val="910"/>
+        <w:pStyle w:val="911"/>
         <w:numPr>
           <w:ilvl w:val="0"/>
           <w:numId w:val="2"/>
@@ -6812,7 +7099,7 @@
     </w:p>
     <w:p>
       <w:pPr>
-        <w:pStyle w:val="910"/>
+        <w:pStyle w:val="911"/>
         <w:numPr>
           <w:ilvl w:val="0"/>
           <w:numId w:val="2"/>
@@ -6846,7 +7133,7 @@
     </w:p>
     <w:p>
       <w:pPr>
-        <w:pStyle w:val="910"/>
+        <w:pStyle w:val="911"/>
         <w:numPr>
           <w:ilvl w:val="0"/>
           <w:numId w:val="2"/>
@@ -6880,7 +7167,7 @@
     </w:p>
     <w:p>
       <w:pPr>
-        <w:pStyle w:val="910"/>
+        <w:pStyle w:val="911"/>
         <w:numPr>
           <w:ilvl w:val="0"/>
           <w:numId w:val="2"/>
@@ -6914,7 +7201,7 @@
     </w:p>
     <w:p>
       <w:pPr>
-        <w:pStyle w:val="910"/>
+        <w:pStyle w:val="911"/>
         <w:numPr>
           <w:ilvl w:val="0"/>
           <w:numId w:val="2"/>
@@ -6948,7 +7235,7 @@
     </w:p>
     <w:p>
       <w:pPr>
-        <w:pStyle w:val="910"/>
+        <w:pStyle w:val="911"/>
         <w:numPr>
           <w:ilvl w:val="0"/>
           <w:numId w:val="2"/>
@@ -7008,7 +7295,7 @@
     </w:p>
     <w:p>
       <w:pPr>
-        <w:pStyle w:val="919"/>
+        <w:pStyle w:val="920"/>
         <w:pBdr/>
         <w:spacing/>
         <w:ind/>
@@ -7036,7 +7323,7 @@
     </w:p>
     <w:p>
       <w:pPr>
-        <w:pStyle w:val="920"/>
+        <w:pStyle w:val="921"/>
         <w:pBdr/>
         <w:spacing/>
         <w:ind/>
@@ -8379,7 +8666,7 @@
     </w:p>
     <w:p>
       <w:pPr>
-        <w:pStyle w:val="920"/>
+        <w:pStyle w:val="921"/>
         <w:pBdr/>
         <w:spacing/>
         <w:ind/>
@@ -10804,7 +11091,7 @@
     </w:p>
     <w:p>
       <w:pPr>
-        <w:pStyle w:val="920"/>
+        <w:pStyle w:val="921"/>
         <w:pBdr/>
         <w:spacing/>
         <w:ind/>
@@ -11201,7 +11488,7 @@
                 <w:szCs w:val="20"/>
                 <w:lang w:val="fr-FR"/>
               </w:rPr>
-              <w:t xml:space="preserve">Double affichage des widgets Kivy au démarrage (notifications côte à côte)</w:t>
+              <w:t xml:space="preserve">Double affichage des alertes Kivy au démarrage (notifications côte à côte)</w:t>
             </w:r>
             <w:r>
               <w:rPr>
@@ -11965,7 +12252,7 @@
     </w:p>
     <w:p>
       <w:pPr>
-        <w:pStyle w:val="918"/>
+        <w:pStyle w:val="919"/>
         <w:pBdr/>
         <w:spacing/>
         <w:ind/>
@@ -11993,7 +12280,7 @@
     </w:p>
     <w:p>
       <w:pPr>
-        <w:pStyle w:val="919"/>
+        <w:pStyle w:val="920"/>
         <w:pBdr/>
         <w:spacing/>
         <w:ind/>
@@ -12051,7 +12338,7 @@
     </w:p>
     <w:p>
       <w:pPr>
-        <w:pStyle w:val="910"/>
+        <w:pStyle w:val="911"/>
         <w:numPr>
           <w:ilvl w:val="0"/>
           <w:numId w:val="2"/>
@@ -12085,7 +12372,7 @@
     </w:p>
     <w:p>
       <w:pPr>
-        <w:pStyle w:val="910"/>
+        <w:pStyle w:val="911"/>
         <w:numPr>
           <w:ilvl w:val="0"/>
           <w:numId w:val="2"/>
@@ -12119,7 +12406,7 @@
     </w:p>
     <w:p>
       <w:pPr>
-        <w:pStyle w:val="910"/>
+        <w:pStyle w:val="911"/>
         <w:numPr>
           <w:ilvl w:val="0"/>
           <w:numId w:val="2"/>
@@ -12153,7 +12440,7 @@
     </w:p>
     <w:p>
       <w:pPr>
-        <w:pStyle w:val="910"/>
+        <w:pStyle w:val="911"/>
         <w:numPr>
           <w:ilvl w:val="0"/>
           <w:numId w:val="2"/>
@@ -12187,7 +12474,7 @@
     </w:p>
     <w:p>
       <w:pPr>
-        <w:pStyle w:val="910"/>
+        <w:pStyle w:val="911"/>
         <w:numPr>
           <w:ilvl w:val="0"/>
           <w:numId w:val="2"/>
@@ -12221,7 +12508,7 @@
     </w:p>
     <w:p>
       <w:pPr>
-        <w:pStyle w:val="910"/>
+        <w:pStyle w:val="911"/>
         <w:numPr>
           <w:ilvl w:val="0"/>
           <w:numId w:val="2"/>
@@ -12255,7 +12542,7 @@
     </w:p>
     <w:p>
       <w:pPr>
-        <w:pStyle w:val="910"/>
+        <w:pStyle w:val="911"/>
         <w:numPr>
           <w:ilvl w:val="0"/>
           <w:numId w:val="2"/>
@@ -12289,7 +12576,7 @@
     </w:p>
     <w:p>
       <w:pPr>
-        <w:pStyle w:val="910"/>
+        <w:pStyle w:val="911"/>
         <w:numPr>
           <w:ilvl w:val="0"/>
           <w:numId w:val="2"/>
@@ -12323,7 +12610,7 @@
     </w:p>
     <w:p>
       <w:pPr>
-        <w:pStyle w:val="919"/>
+        <w:pStyle w:val="920"/>
         <w:pBdr/>
         <w:spacing/>
         <w:ind/>
@@ -12336,7 +12623,7 @@
           <w:rFonts w:ascii="Arial" w:hAnsi="Arial" w:eastAsia="Arial" w:cs="Arial"/>
           <w:lang w:val="fr-FR"/>
         </w:rPr>
-        <w:t xml:space="preserve">3.2 – Parties restant à développer</w:t>
+        <w:t xml:space="preserve">3.2 – Améliorations possibles</w:t>
       </w:r>
       <w:r>
         <w:rPr>
@@ -12351,7 +12638,7 @@
     </w:p>
     <w:p>
       <w:pPr>
-        <w:pStyle w:val="910"/>
+        <w:pStyle w:val="911"/>
         <w:numPr>
           <w:ilvl w:val="0"/>
           <w:numId w:val="2"/>
@@ -12370,7 +12657,7 @@
           <w:szCs w:val="22"/>
           <w:lang w:val="fr-FR"/>
         </w:rPr>
-        <w:t xml:space="preserve">Rédaction formelle des rapports de tests unitaires CapteurParticules et IHM (en cours à 70-90 %).</w:t>
+        <w:t xml:space="preserve">Implémentation de tests unitaires automatisés avec pytest et unittest.mock pour simuler le port série et le broker MQTT sans matériel réel, ce qui faciliterait les tests en environnement de développement.</w:t>
       </w:r>
       <w:r>
         <w:rPr>
@@ -12385,7 +12672,7 @@
     </w:p>
     <w:p>
       <w:pPr>
-        <w:pStyle w:val="910"/>
+        <w:pStyle w:val="911"/>
         <w:numPr>
           <w:ilvl w:val="0"/>
           <w:numId w:val="2"/>
@@ -12404,7 +12691,7 @@
           <w:szCs w:val="22"/>
           <w:lang w:val="fr-FR"/>
         </w:rPr>
-        <w:t xml:space="preserve">Test de reconnexion du capteur SDS011 en conditions réelles (débranchement/rebranchement USB).</w:t>
+        <w:t xml:space="preserve">Mise en place d'un watchdog logiciel (threading.Timer) qui redémarre les threads de mesure s'ils se terminent de manière inattendue.</w:t>
       </w:r>
       <w:r>
         <w:rPr>
@@ -12419,7 +12706,7 @@
     </w:p>
     <w:p>
       <w:pPr>
-        <w:pStyle w:val="910"/>
+        <w:pStyle w:val="911"/>
         <w:numPr>
           <w:ilvl w:val="0"/>
           <w:numId w:val="2"/>
@@ -12433,234 +12720,31 @@
       </w:pPr>
       <w:r>
         <w:rPr>
-          <w:rFonts w:ascii="Arial" w:hAnsi="Arial" w:eastAsia="Arial" w:cs="Arial"/>
-          <w:sz w:val="22"/>
-          <w:szCs w:val="22"/>
-          <w:lang w:val="fr-FR"/>
-        </w:rPr>
-        <w:t xml:space="preserve">Test d'intégration complet avec la partie étudiant 2 (TVOC/CO2) et l'infrastructure réseau physique.</w:t>
-      </w:r>
-      <w:r>
-        <w:rPr>
-          <w:lang w:val="fr-FR"/>
-        </w:rPr>
-      </w:r>
-      <w:r>
-        <w:rPr>
-          <w:lang w:val="fr-FR"/>
-        </w:rPr>
-      </w:r>
-    </w:p>
-    <w:p>
-      <w:pPr>
-        <w:pStyle w:val="910"/>
-        <w:numPr>
-          <w:ilvl w:val="0"/>
-          <w:numId w:val="2"/>
-        </w:numPr>
-        <w:pBdr/>
-        <w:spacing w:after="80"/>
-        <w:ind/>
-        <w:rPr>
-          <w:lang w:val="fr-FR"/>
-        </w:rPr>
-      </w:pPr>
-      <w:r>
-        <w:rPr>
-          <w:rFonts w:ascii="Arial" w:hAnsi="Arial" w:eastAsia="Arial" w:cs="Arial"/>
-          <w:sz w:val="22"/>
-          <w:szCs w:val="22"/>
-          <w:lang w:val="fr-FR"/>
-        </w:rPr>
-        <w:t xml:space="preserve">Validation de la connexion TLS avec le certificat CA du broker de production (marais2026.btssn.ovh).</w:t>
-      </w:r>
-      <w:r>
-        <w:rPr>
-          <w:lang w:val="fr-FR"/>
-        </w:rPr>
-      </w:r>
-      <w:r>
-        <w:rPr>
-          <w:lang w:val="fr-FR"/>
-        </w:rPr>
-      </w:r>
-    </w:p>
-    <w:p>
-      <w:pPr>
-        <w:pStyle w:val="919"/>
-        <w:pBdr/>
-        <w:spacing/>
-        <w:ind/>
-        <w:rPr>
-          <w:lang w:val="fr-FR"/>
-        </w:rPr>
-      </w:pPr>
-      <w:r>
-        <w:rPr>
-          <w:rFonts w:ascii="Arial" w:hAnsi="Arial" w:eastAsia="Arial" w:cs="Arial"/>
-          <w:lang w:val="fr-FR"/>
-        </w:rPr>
-        <w:t xml:space="preserve">3.3 – Améliorations possibles</w:t>
-      </w:r>
-      <w:r>
-        <w:rPr>
-          <w:lang w:val="fr-FR"/>
-        </w:rPr>
-      </w:r>
-      <w:r>
-        <w:rPr>
-          <w:lang w:val="fr-FR"/>
-        </w:rPr>
-      </w:r>
-    </w:p>
-    <w:p>
-      <w:pPr>
-        <w:pStyle w:val="910"/>
-        <w:numPr>
-          <w:ilvl w:val="0"/>
-          <w:numId w:val="2"/>
-        </w:numPr>
-        <w:pBdr/>
-        <w:spacing w:after="80"/>
-        <w:ind/>
-        <w:rPr>
-          <w:lang w:val="fr-FR"/>
-        </w:rPr>
-      </w:pPr>
-      <w:r>
-        <w:rPr>
-          <w:rFonts w:ascii="Arial" w:hAnsi="Arial" w:eastAsia="Arial" w:cs="Arial"/>
-          <w:sz w:val="22"/>
-          <w:szCs w:val="22"/>
-          <w:lang w:val="fr-FR"/>
-        </w:rPr>
-        <w:t xml:space="preserve">Remplacement des print() par un système de logging Python (module logging avec niveaux info/debug/warning/error), comme le prescrit la contrainte de qualité du codage.</w:t>
-      </w:r>
-      <w:r>
-        <w:rPr>
-          <w:lang w:val="fr-FR"/>
-        </w:rPr>
-      </w:r>
-      <w:r>
-        <w:rPr>
-          <w:lang w:val="fr-FR"/>
-        </w:rPr>
-      </w:r>
-    </w:p>
-    <w:p>
-      <w:pPr>
-        <w:pStyle w:val="910"/>
-        <w:numPr>
-          <w:ilvl w:val="0"/>
-          <w:numId w:val="2"/>
-        </w:numPr>
-        <w:pBdr/>
-        <w:spacing w:after="80"/>
-        <w:ind/>
-        <w:rPr>
-          <w:lang w:val="fr-FR"/>
-        </w:rPr>
-      </w:pPr>
-      <w:r>
-        <w:rPr>
-          <w:rFonts w:ascii="Arial" w:hAnsi="Arial" w:eastAsia="Arial" w:cs="Arial"/>
-          <w:sz w:val="22"/>
-          <w:szCs w:val="22"/>
-          <w:lang w:val="fr-FR"/>
-        </w:rPr>
-        <w:t xml:space="preserve">Implémentation de tests unitaires automatisés avec pytest et unittest.mock pour simuler le port série et le broker MQTT sans matériel réel, ce qui faciliterait les tests en environnement de développement.</w:t>
-      </w:r>
-      <w:r>
-        <w:rPr>
-          <w:lang w:val="fr-FR"/>
-        </w:rPr>
-      </w:r>
-      <w:r>
-        <w:rPr>
-          <w:lang w:val="fr-FR"/>
-        </w:rPr>
-      </w:r>
-    </w:p>
-    <w:p>
-      <w:pPr>
-        <w:pStyle w:val="910"/>
-        <w:numPr>
-          <w:ilvl w:val="0"/>
-          <w:numId w:val="2"/>
-        </w:numPr>
-        <w:pBdr/>
-        <w:spacing w:after="80"/>
-        <w:ind/>
-        <w:rPr>
-          <w:lang w:val="fr-FR"/>
-        </w:rPr>
-      </w:pPr>
-      <w:r>
-        <w:rPr>
-          <w:rFonts w:ascii="Arial" w:hAnsi="Arial" w:eastAsia="Arial" w:cs="Arial"/>
-          <w:sz w:val="22"/>
-          <w:szCs w:val="22"/>
-          <w:lang w:val="fr-FR"/>
-        </w:rPr>
-        <w:t xml:space="preserve">Ajout d'un affichage de la valeur PM2.5 (actuellement ignorée par le capteur, car seul PM10 est affiché) pour fournir une information complémentaire aux employés.</w:t>
-      </w:r>
-      <w:r>
-        <w:rPr>
-          <w:lang w:val="fr-FR"/>
-        </w:rPr>
-      </w:r>
-      <w:r>
-        <w:rPr>
-          <w:lang w:val="fr-FR"/>
-        </w:rPr>
-      </w:r>
-    </w:p>
-    <w:p>
-      <w:pPr>
-        <w:pStyle w:val="910"/>
-        <w:numPr>
-          <w:ilvl w:val="0"/>
-          <w:numId w:val="2"/>
-        </w:numPr>
-        <w:pBdr/>
-        <w:spacing w:after="80"/>
-        <w:ind/>
-        <w:rPr>
-          <w:lang w:val="fr-FR"/>
-        </w:rPr>
-      </w:pPr>
-      <w:r>
-        <w:rPr>
-          <w:rFonts w:ascii="Arial" w:hAnsi="Arial" w:eastAsia="Arial" w:cs="Arial"/>
-          <w:sz w:val="22"/>
-          <w:szCs w:val="22"/>
-          <w:lang w:val="fr-FR"/>
-        </w:rPr>
-        <w:t xml:space="preserve">Mise en place d'un watchdog logiciel (threading.Timer) qui redémarre les threads de mesure s'ils se terminent de manière inattendue.</w:t>
-      </w:r>
-      <w:r>
-        <w:rPr>
-          <w:lang w:val="fr-FR"/>
-        </w:rPr>
-      </w:r>
-      <w:r>
-        <w:rPr>
-          <w:lang w:val="fr-FR"/>
-        </w:rPr>
-      </w:r>
-    </w:p>
-    <w:p>
-      <w:pPr>
-        <w:pBdr/>
-        <w:spacing w:after="200"/>
-        <w:ind/>
-        <w:rPr>
-          <w:lang w:val="fr-FR"/>
-        </w:rPr>
-      </w:pPr>
-      <w:r>
-        <w:rPr>
+          <w:highlight w:val="none"/>
           <w:lang w:val="fr-FR" w:bidi="fr-FR"/>
+        </w:rPr>
+        <w:t xml:space="preserve">Création de boîtes pour contenir et fixer les différents </w:t>
+      </w:r>
+      <w:r>
+        <w:rPr>
+          <w:highlight w:val="none"/>
+          <w:lang w:val="fr-FR" w:bidi="fr-FR"/>
+        </w:rPr>
+      </w:r>
+      <w:r>
+        <w:rPr>
+          <w:highlight w:val="none"/>
+          <w:lang w:val="fr-FR"/>
+        </w:rPr>
+      </w:r>
+      <w:r>
+        <w:rPr>
+          <w:lang w:val="fr-FR" w:bidi="fr-FR"/>
+        </w:rPr>
+      </w:r>
+      <w:r>
+        <w:rPr>
+          <w:lang w:val="fr-FR"/>
         </w:rPr>
       </w:r>
       <w:r>
@@ -13398,7 +13482,7 @@
     <w:lsdException w:name="Bibliography" w:uiPriority="37"/>
     <w:lsdException w:name="TOC Heading" w:uiPriority="39" w:qFormat="1"/>
   </w:latentStyles>
-  <w:style w:type="table" w:styleId="731" w:default="1">
+  <w:style w:type="table" w:styleId="732" w:default="1">
     <w:name w:val="Normal Table"/>
     <w:uiPriority w:val="99"/>
     <w:semiHidden/>
@@ -13591,9 +13675,9 @@
       </w:tcPr>
     </w:tblStylePr>
   </w:style>
-  <w:style w:type="table" w:styleId="732">
+  <w:style w:type="table" w:styleId="733">
     <w:name w:val="Table Grid"/>
-    <w:basedOn w:val="731"/>
+    <w:basedOn w:val="732"/>
     <w:uiPriority w:val="59"/>
     <w:pPr>
       <w:pBdr/>
@@ -13790,9 +13874,9 @@
       </w:tcPr>
     </w:tblStylePr>
   </w:style>
-  <w:style w:type="table" w:styleId="733">
+  <w:style w:type="table" w:styleId="734">
     <w:name w:val="Table Grid Light"/>
-    <w:basedOn w:val="731"/>
+    <w:basedOn w:val="732"/>
     <w:uiPriority w:val="59"/>
     <w:pPr>
       <w:pBdr/>
@@ -13989,9 +14073,9 @@
       </w:tcPr>
     </w:tblStylePr>
   </w:style>
-  <w:style w:type="table" w:styleId="734">
+  <w:style w:type="table" w:styleId="735">
     <w:name w:val="Plain Table 1"/>
-    <w:basedOn w:val="731"/>
+    <w:basedOn w:val="732"/>
     <w:uiPriority w:val="59"/>
     <w:pPr>
       <w:pBdr/>
@@ -14214,9 +14298,9 @@
       </w:tcPr>
     </w:tblStylePr>
   </w:style>
-  <w:style w:type="table" w:styleId="735">
+  <w:style w:type="table" w:styleId="736">
     <w:name w:val="Plain Table 2"/>
-    <w:basedOn w:val="731"/>
+    <w:basedOn w:val="732"/>
     <w:uiPriority w:val="59"/>
     <w:pPr>
       <w:pBdr/>
@@ -14447,9 +14531,9 @@
       </w:tcPr>
     </w:tblStylePr>
   </w:style>
-  <w:style w:type="table" w:styleId="736">
+  <w:style w:type="table" w:styleId="737">
     <w:name w:val="Plain Table 3"/>
-    <w:basedOn w:val="731"/>
+    <w:basedOn w:val="732"/>
     <w:uiPriority w:val="99"/>
     <w:pPr>
       <w:pBdr/>
@@ -14677,9 +14761,9 @@
       </w:tcPr>
     </w:tblStylePr>
   </w:style>
-  <w:style w:type="table" w:styleId="737">
+  <w:style w:type="table" w:styleId="738">
     <w:name w:val="Plain Table 4"/>
-    <w:basedOn w:val="731"/>
+    <w:basedOn w:val="732"/>
     <w:uiPriority w:val="99"/>
     <w:pPr>
       <w:pBdr/>
@@ -14893,9 +14977,9 @@
       </w:tcPr>
     </w:tblStylePr>
   </w:style>
-  <w:style w:type="table" w:styleId="738">
+  <w:style w:type="table" w:styleId="739">
     <w:name w:val="Plain Table 5"/>
-    <w:basedOn w:val="731"/>
+    <w:basedOn w:val="732"/>
     <w:uiPriority w:val="99"/>
     <w:pPr>
       <w:pBdr/>
@@ -15126,9 +15210,9 @@
       </w:tcPr>
     </w:tblStylePr>
   </w:style>
-  <w:style w:type="table" w:styleId="739">
+  <w:style w:type="table" w:styleId="740">
     <w:name w:val="Grid Table 1 Light"/>
-    <w:basedOn w:val="731"/>
+    <w:basedOn w:val="732"/>
     <w:uiPriority w:val="99"/>
     <w:pPr>
       <w:pBdr/>
@@ -15349,9 +15433,9 @@
       </w:tcPr>
     </w:tblStylePr>
   </w:style>
-  <w:style w:type="table" w:styleId="740">
+  <w:style w:type="table" w:styleId="741">
     <w:name w:val="Grid Table 1 Light - Accent 1"/>
-    <w:basedOn w:val="731"/>
+    <w:basedOn w:val="732"/>
     <w:uiPriority w:val="99"/>
     <w:pPr>
       <w:pBdr/>
@@ -15572,9 +15656,9 @@
       </w:tcPr>
     </w:tblStylePr>
   </w:style>
-  <w:style w:type="table" w:styleId="741">
+  <w:style w:type="table" w:styleId="742">
     <w:name w:val="Grid Table 1 Light - Accent 2"/>
-    <w:basedOn w:val="731"/>
+    <w:basedOn w:val="732"/>
     <w:uiPriority w:val="99"/>
     <w:pPr>
       <w:pBdr/>
@@ -15795,9 +15879,9 @@
       </w:tcPr>
     </w:tblStylePr>
   </w:style>
-  <w:style w:type="table" w:styleId="742">
+  <w:style w:type="table" w:styleId="743">
     <w:name w:val="Grid Table 1 Light - Accent 3"/>
-    <w:basedOn w:val="731"/>
+    <w:basedOn w:val="732"/>
     <w:uiPriority w:val="99"/>
     <w:pPr>
       <w:pBdr/>
@@ -16018,9 +16102,9 @@
       </w:tcPr>
     </w:tblStylePr>
   </w:style>
-  <w:style w:type="table" w:styleId="743">
+  <w:style w:type="table" w:styleId="744">
     <w:name w:val="Grid Table 1 Light - Accent 4"/>
-    <w:basedOn w:val="731"/>
+    <w:basedOn w:val="732"/>
     <w:uiPriority w:val="99"/>
     <w:pPr>
       <w:pBdr/>
@@ -16241,9 +16325,9 @@
       </w:tcPr>
     </w:tblStylePr>
   </w:style>
-  <w:style w:type="table" w:styleId="744">
+  <w:style w:type="table" w:styleId="745">
     <w:name w:val="Grid Table 1 Light - Accent 5"/>
-    <w:basedOn w:val="731"/>
+    <w:basedOn w:val="732"/>
     <w:uiPriority w:val="99"/>
     <w:pPr>
       <w:pBdr/>
@@ -16464,9 +16548,9 @@
       </w:tcPr>
     </w:tblStylePr>
   </w:style>
-  <w:style w:type="table" w:styleId="745">
+  <w:style w:type="table" w:styleId="746">
     <w:name w:val="Grid Table 1 Light - Accent 6"/>
-    <w:basedOn w:val="731"/>
+    <w:basedOn w:val="732"/>
     <w:uiPriority w:val="99"/>
     <w:pPr>
       <w:pBdr/>
@@ -16687,9 +16771,9 @@
       </w:tcPr>
     </w:tblStylePr>
   </w:style>
-  <w:style w:type="table" w:styleId="746">
+  <w:style w:type="table" w:styleId="747">
     <w:name w:val="Grid Table 2"/>
-    <w:basedOn w:val="731"/>
+    <w:basedOn w:val="732"/>
     <w:uiPriority w:val="99"/>
     <w:pPr>
       <w:pBdr/>
@@ -16919,9 +17003,9 @@
       </w:tcPr>
     </w:tblStylePr>
   </w:style>
-  <w:style w:type="table" w:styleId="747">
+  <w:style w:type="table" w:styleId="748">
     <w:name w:val="Grid Table 2 - Accent 1"/>
-    <w:basedOn w:val="731"/>
+    <w:basedOn w:val="732"/>
     <w:uiPriority w:val="99"/>
     <w:pPr>
       <w:pBdr/>
@@ -17151,9 +17235,9 @@
       </w:tcPr>
     </w:tblStylePr>
   </w:style>
-  <w:style w:type="table" w:styleId="748">
+  <w:style w:type="table" w:styleId="749">
     <w:name w:val="Grid Table 2 - Accent 2"/>
-    <w:basedOn w:val="731"/>
+    <w:basedOn w:val="732"/>
     <w:uiPriority w:val="99"/>
     <w:pPr>
       <w:pBdr/>
@@ -17383,9 +17467,9 @@
       </w:tcPr>
     </w:tblStylePr>
   </w:style>
-  <w:style w:type="table" w:styleId="749">
+  <w:style w:type="table" w:styleId="750">
     <w:name w:val="Grid Table 2 - Accent 3"/>
-    <w:basedOn w:val="731"/>
+    <w:basedOn w:val="732"/>
     <w:uiPriority w:val="99"/>
     <w:pPr>
       <w:pBdr/>
@@ -17615,9 +17699,9 @@
       </w:tcPr>
     </w:tblStylePr>
   </w:style>
-  <w:style w:type="table" w:styleId="750">
+  <w:style w:type="table" w:styleId="751">
     <w:name w:val="Grid Table 2 - Accent 4"/>
-    <w:basedOn w:val="731"/>
+    <w:basedOn w:val="732"/>
     <w:uiPriority w:val="99"/>
     <w:pPr>
       <w:pBdr/>
@@ -17847,9 +17931,9 @@
       </w:tcPr>
     </w:tblStylePr>
   </w:style>
-  <w:style w:type="table" w:styleId="751">
+  <w:style w:type="table" w:styleId="752">
     <w:name w:val="Grid Table 2 - Accent 5"/>
-    <w:basedOn w:val="731"/>
+    <w:basedOn w:val="732"/>
     <w:uiPriority w:val="99"/>
     <w:pPr>
       <w:pBdr/>
@@ -18079,9 +18163,9 @@
       </w:tcPr>
     </w:tblStylePr>
   </w:style>
-  <w:style w:type="table" w:styleId="752">
+  <w:style w:type="table" w:styleId="753">
     <w:name w:val="Grid Table 2 - Accent 6"/>
-    <w:basedOn w:val="731"/>
+    <w:basedOn w:val="732"/>
     <w:uiPriority w:val="99"/>
     <w:pPr>
       <w:pBdr/>
@@ -18311,9 +18395,9 @@
       </w:tcPr>
     </w:tblStylePr>
   </w:style>
-  <w:style w:type="table" w:styleId="753">
+  <w:style w:type="table" w:styleId="754">
     <w:name w:val="Grid Table 3"/>
-    <w:basedOn w:val="731"/>
+    <w:basedOn w:val="732"/>
     <w:uiPriority w:val="99"/>
     <w:pPr>
       <w:pBdr/>
@@ -18556,9 +18640,9 @@
       </w:tcPr>
     </w:tblStylePr>
   </w:style>
-  <w:style w:type="table" w:styleId="754">
+  <w:style w:type="table" w:styleId="755">
     <w:name w:val="Grid Table 3 - Accent 1"/>
-    <w:basedOn w:val="731"/>
+    <w:basedOn w:val="732"/>
     <w:uiPriority w:val="99"/>
     <w:pPr>
       <w:pBdr/>
@@ -18801,9 +18885,9 @@
       </w:tcPr>
     </w:tblStylePr>
   </w:style>
-  <w:style w:type="table" w:styleId="755">
+  <w:style w:type="table" w:styleId="756">
     <w:name w:val="Grid Table 3 - Accent 2"/>
-    <w:basedOn w:val="731"/>
+    <w:basedOn w:val="732"/>
     <w:uiPriority w:val="99"/>
     <w:pPr>
       <w:pBdr/>
@@ -19046,9 +19130,9 @@
       </w:tcPr>
     </w:tblStylePr>
   </w:style>
-  <w:style w:type="table" w:styleId="756">
+  <w:style w:type="table" w:styleId="757">
     <w:name w:val="Grid Table 3 - Accent 3"/>
-    <w:basedOn w:val="731"/>
+    <w:basedOn w:val="732"/>
     <w:uiPriority w:val="99"/>
     <w:pPr>
       <w:pBdr/>
@@ -19291,9 +19375,9 @@
       </w:tcPr>
     </w:tblStylePr>
   </w:style>
-  <w:style w:type="table" w:styleId="757">
+  <w:style w:type="table" w:styleId="758">
     <w:name w:val="Grid Table 3 - Accent 4"/>
-    <w:basedOn w:val="731"/>
+    <w:basedOn w:val="732"/>
     <w:uiPriority w:val="99"/>
     <w:pPr>
       <w:pBdr/>
@@ -19536,9 +19620,9 @@
       </w:tcPr>
     </w:tblStylePr>
   </w:style>
-  <w:style w:type="table" w:styleId="758">
+  <w:style w:type="table" w:styleId="759">
     <w:name w:val="Grid Table 3 - Accent 5"/>
-    <w:basedOn w:val="731"/>
+    <w:basedOn w:val="732"/>
     <w:uiPriority w:val="99"/>
     <w:pPr>
       <w:pBdr/>
@@ -19781,9 +19865,9 @@
       </w:tcPr>
     </w:tblStylePr>
   </w:style>
-  <w:style w:type="table" w:styleId="759">
+  <w:style w:type="table" w:styleId="760">
     <w:name w:val="Grid Table 3 - Accent 6"/>
-    <w:basedOn w:val="731"/>
+    <w:basedOn w:val="732"/>
     <w:uiPriority w:val="99"/>
     <w:pPr>
       <w:pBdr/>
@@ -20026,9 +20110,9 @@
       </w:tcPr>
     </w:tblStylePr>
   </w:style>
-  <w:style w:type="table" w:styleId="760">
+  <w:style w:type="table" w:styleId="761">
     <w:name w:val="Grid Table 4"/>
-    <w:basedOn w:val="731"/>
+    <w:basedOn w:val="732"/>
     <w:uiPriority w:val="59"/>
     <w:pPr>
       <w:pBdr/>
@@ -20259,9 +20343,9 @@
       </w:tcPr>
     </w:tblStylePr>
   </w:style>
-  <w:style w:type="table" w:styleId="761">
+  <w:style w:type="table" w:styleId="762">
     <w:name w:val="Grid Table 4 - Accent 1"/>
-    <w:basedOn w:val="731"/>
+    <w:basedOn w:val="732"/>
     <w:uiPriority w:val="59"/>
     <w:pPr>
       <w:pBdr/>
@@ -20492,9 +20576,9 @@
       </w:tcPr>
     </w:tblStylePr>
   </w:style>
-  <w:style w:type="table" w:styleId="762">
+  <w:style w:type="table" w:styleId="763">
     <w:name w:val="Grid Table 4 - Accent 2"/>
-    <w:basedOn w:val="731"/>
+    <w:basedOn w:val="732"/>
     <w:uiPriority w:val="59"/>
     <w:pPr>
       <w:pBdr/>
@@ -20725,9 +20809,9 @@
       </w:tcPr>
     </w:tblStylePr>
   </w:style>
-  <w:style w:type="table" w:styleId="763">
+  <w:style w:type="table" w:styleId="764">
     <w:name w:val="Grid Table 4 - Accent 3"/>
-    <w:basedOn w:val="731"/>
+    <w:basedOn w:val="732"/>
     <w:uiPriority w:val="59"/>
     <w:pPr>
       <w:pBdr/>
@@ -20958,9 +21042,9 @@
       </w:tcPr>
     </w:tblStylePr>
   </w:style>
-  <w:style w:type="table" w:styleId="764">
+  <w:style w:type="table" w:styleId="765">
     <w:name w:val="Grid Table 4 - Accent 4"/>
-    <w:basedOn w:val="731"/>
+    <w:basedOn w:val="732"/>
     <w:uiPriority w:val="59"/>
     <w:pPr>
       <w:pBdr/>
@@ -21191,9 +21275,9 @@
       </w:tcPr>
     </w:tblStylePr>
   </w:style>
-  <w:style w:type="table" w:styleId="765">
+  <w:style w:type="table" w:styleId="766">
     <w:name w:val="Grid Table 4 - Accent 5"/>
-    <w:basedOn w:val="731"/>
+    <w:basedOn w:val="732"/>
     <w:uiPriority w:val="59"/>
     <w:pPr>
       <w:pBdr/>
@@ -21424,9 +21508,9 @@
       </w:tcPr>
     </w:tblStylePr>
   </w:style>
-  <w:style w:type="table" w:styleId="766">
+  <w:style w:type="table" w:styleId="767">
     <w:name w:val="Grid Table 4 - Accent 6"/>
-    <w:basedOn w:val="731"/>
+    <w:basedOn w:val="732"/>
     <w:uiPriority w:val="59"/>
     <w:pPr>
       <w:pBdr/>
@@ -21657,9 +21741,9 @@
       </w:tcPr>
     </w:tblStylePr>
   </w:style>
-  <w:style w:type="table" w:styleId="767">
+  <w:style w:type="table" w:styleId="768">
     <w:name w:val="Grid Table 5 Dark"/>
-    <w:basedOn w:val="731"/>
+    <w:basedOn w:val="732"/>
     <w:uiPriority w:val="99"/>
     <w:pPr>
       <w:pBdr/>
@@ -21885,9 +21969,9 @@
       </w:tcPr>
     </w:tblStylePr>
   </w:style>
-  <w:style w:type="table" w:styleId="768">
+  <w:style w:type="table" w:styleId="769">
     <w:name w:val="Grid Table 5 Dark- Accent 1"/>
-    <w:basedOn w:val="731"/>
+    <w:basedOn w:val="732"/>
     <w:uiPriority w:val="99"/>
     <w:pPr>
       <w:pBdr/>
@@ -22113,9 +22197,9 @@
       </w:tcPr>
     </w:tblStylePr>
   </w:style>
-  <w:style w:type="table" w:styleId="769">
+  <w:style w:type="table" w:styleId="770">
     <w:name w:val="Grid Table 5 Dark - Accent 2"/>
-    <w:basedOn w:val="731"/>
+    <w:basedOn w:val="732"/>
     <w:uiPriority w:val="99"/>
     <w:pPr>
       <w:pBdr/>
@@ -22341,9 +22425,9 @@
       </w:tcPr>
     </w:tblStylePr>
   </w:style>
-  <w:style w:type="table" w:styleId="770">
+  <w:style w:type="table" w:styleId="771">
     <w:name w:val="Grid Table 5 Dark - Accent 3"/>
-    <w:basedOn w:val="731"/>
+    <w:basedOn w:val="732"/>
     <w:uiPriority w:val="99"/>
     <w:pPr>
       <w:pBdr/>
@@ -22569,9 +22653,9 @@
       </w:tcPr>
     </w:tblStylePr>
   </w:style>
-  <w:style w:type="table" w:styleId="771">
+  <w:style w:type="table" w:styleId="772">
     <w:name w:val="Grid Table 5 Dark- Accent 4"/>
-    <w:basedOn w:val="731"/>
+    <w:basedOn w:val="732"/>
     <w:uiPriority w:val="99"/>
     <w:pPr>
       <w:pBdr/>
@@ -22797,9 +22881,9 @@
       </w:tcPr>
     </w:tblStylePr>
   </w:style>
-  <w:style w:type="table" w:styleId="772">
+  <w:style w:type="table" w:styleId="773">
     <w:name w:val="Grid Table 5 Dark - Accent 5"/>
-    <w:basedOn w:val="731"/>
+    <w:basedOn w:val="732"/>
     <w:uiPriority w:val="99"/>
     <w:pPr>
       <w:pBdr/>
@@ -23025,9 +23109,9 @@
       </w:tcPr>
     </w:tblStylePr>
   </w:style>
-  <w:style w:type="table" w:styleId="773">
+  <w:style w:type="table" w:styleId="774">
     <w:name w:val="Grid Table 5 Dark - Accent 6"/>
-    <w:basedOn w:val="731"/>
+    <w:basedOn w:val="732"/>
     <w:uiPriority w:val="99"/>
     <w:pPr>
       <w:pBdr/>
@@ -23253,9 +23337,9 @@
       </w:tcPr>
     </w:tblStylePr>
   </w:style>
-  <w:style w:type="table" w:styleId="774">
+  <w:style w:type="table" w:styleId="775">
     <w:name w:val="Grid Table 6 Colorful"/>
-    <w:basedOn w:val="731"/>
+    <w:basedOn w:val="732"/>
     <w:uiPriority w:val="99"/>
     <w:pPr>
       <w:pBdr/>
@@ -23483,9 +23567,9 @@
       </w:tcPr>
     </w:tblStylePr>
   </w:style>
-  <w:style w:type="table" w:styleId="775">
+  <w:style w:type="table" w:styleId="776">
     <w:name w:val="Grid Table 6 Colorful - Accent 1"/>
-    <w:basedOn w:val="731"/>
+    <w:basedOn w:val="732"/>
     <w:uiPriority w:val="99"/>
     <w:pPr>
       <w:pBdr/>
@@ -23713,9 +23797,9 @@
       </w:tcPr>
     </w:tblStylePr>
   </w:style>
-  <w:style w:type="table" w:styleId="776">
+  <w:style w:type="table" w:styleId="777">
     <w:name w:val="Grid Table 6 Colorful - Accent 2"/>
-    <w:basedOn w:val="731"/>
+    <w:basedOn w:val="732"/>
     <w:uiPriority w:val="99"/>
     <w:pPr>
       <w:pBdr/>
@@ -23943,9 +24027,9 @@
       </w:tcPr>
     </w:tblStylePr>
   </w:style>
-  <w:style w:type="table" w:styleId="777">
+  <w:style w:type="table" w:styleId="778">
     <w:name w:val="Grid Table 6 Colorful - Accent 3"/>
-    <w:basedOn w:val="731"/>
+    <w:basedOn w:val="732"/>
     <w:uiPriority w:val="99"/>
     <w:pPr>
       <w:pBdr/>
@@ -24173,9 +24257,9 @@
       </w:tcPr>
     </w:tblStylePr>
   </w:style>
-  <w:style w:type="table" w:styleId="778">
+  <w:style w:type="table" w:styleId="779">
     <w:name w:val="Grid Table 6 Colorful - Accent 4"/>
-    <w:basedOn w:val="731"/>
+    <w:basedOn w:val="732"/>
     <w:uiPriority w:val="99"/>
     <w:pPr>
       <w:pBdr/>
@@ -24403,9 +24487,9 @@
       </w:tcPr>
     </w:tblStylePr>
   </w:style>
-  <w:style w:type="table" w:styleId="779">
+  <w:style w:type="table" w:styleId="780">
     <w:name w:val="Grid Table 6 Colorful - Accent 5"/>
-    <w:basedOn w:val="731"/>
+    <w:basedOn w:val="732"/>
     <w:uiPriority w:val="99"/>
     <w:pPr>
       <w:pBdr/>
@@ -24633,9 +24717,9 @@
       </w:tcPr>
     </w:tblStylePr>
   </w:style>
-  <w:style w:type="table" w:styleId="780">
+  <w:style w:type="table" w:styleId="781">
     <w:name w:val="Grid Table 6 Colorful - Accent 6"/>
-    <w:basedOn w:val="731"/>
+    <w:basedOn w:val="732"/>
     <w:uiPriority w:val="99"/>
     <w:pPr>
       <w:pBdr/>
@@ -24863,9 +24947,9 @@
       </w:tcPr>
     </w:tblStylePr>
   </w:style>
-  <w:style w:type="table" w:styleId="781">
+  <w:style w:type="table" w:styleId="782">
     <w:name w:val="Grid Table 7 Colorful"/>
-    <w:basedOn w:val="731"/>
+    <w:basedOn w:val="732"/>
     <w:uiPriority w:val="99"/>
     <w:pPr>
       <w:pBdr/>
@@ -25117,9 +25201,9 @@
       </w:tcPr>
     </w:tblStylePr>
   </w:style>
-  <w:style w:type="table" w:styleId="782">
+  <w:style w:type="table" w:styleId="783">
     <w:name w:val="Grid Table 7 Colorful - Accent 1"/>
-    <w:basedOn w:val="731"/>
+    <w:basedOn w:val="732"/>
     <w:uiPriority w:val="99"/>
     <w:pPr>
       <w:pBdr/>
@@ -25371,9 +25455,9 @@
       </w:tcPr>
     </w:tblStylePr>
   </w:style>
-  <w:style w:type="table" w:styleId="783">
+  <w:style w:type="table" w:styleId="784">
     <w:name w:val="Grid Table 7 Colorful - Accent 2"/>
-    <w:basedOn w:val="731"/>
+    <w:basedOn w:val="732"/>
     <w:uiPriority w:val="99"/>
     <w:pPr>
       <w:pBdr/>
@@ -25625,9 +25709,9 @@
       </w:tcPr>
     </w:tblStylePr>
   </w:style>
-  <w:style w:type="table" w:styleId="784">
+  <w:style w:type="table" w:styleId="785">
     <w:name w:val="Grid Table 7 Colorful - Accent 3"/>
-    <w:basedOn w:val="731"/>
+    <w:basedOn w:val="732"/>
     <w:uiPriority w:val="99"/>
     <w:pPr>
       <w:pBdr/>
@@ -25879,9 +25963,9 @@
       </w:tcPr>
     </w:tblStylePr>
   </w:style>
-  <w:style w:type="table" w:styleId="785">
+  <w:style w:type="table" w:styleId="786">
     <w:name w:val="Grid Table 7 Colorful - Accent 4"/>
-    <w:basedOn w:val="731"/>
+    <w:basedOn w:val="732"/>
     <w:uiPriority w:val="99"/>
     <w:pPr>
       <w:pBdr/>
@@ -26133,9 +26217,9 @@
       </w:tcPr>
     </w:tblStylePr>
   </w:style>
-  <w:style w:type="table" w:styleId="786">
+  <w:style w:type="table" w:styleId="787">
     <w:name w:val="Grid Table 7 Colorful - Accent 5"/>
-    <w:basedOn w:val="731"/>
+    <w:basedOn w:val="732"/>
     <w:uiPriority w:val="99"/>
     <w:pPr>
       <w:pBdr/>
@@ -26387,9 +26471,9 @@
       </w:tcPr>
     </w:tblStylePr>
   </w:style>
-  <w:style w:type="table" w:styleId="787">
+  <w:style w:type="table" w:styleId="788">
     <w:name w:val="Grid Table 7 Colorful - Accent 6"/>
-    <w:basedOn w:val="731"/>
+    <w:basedOn w:val="732"/>
     <w:uiPriority w:val="99"/>
     <w:pPr>
       <w:pBdr/>
@@ -26641,9 +26725,9 @@
       </w:tcPr>
     </w:tblStylePr>
   </w:style>
-  <w:style w:type="table" w:styleId="788">
+  <w:style w:type="table" w:styleId="789">
     <w:name w:val="List Table 1 Light"/>
-    <w:basedOn w:val="731"/>
+    <w:basedOn w:val="732"/>
     <w:uiPriority w:val="99"/>
     <w:pPr>
       <w:pBdr/>
@@ -26857,9 +26941,9 @@
       </w:tcPr>
     </w:tblStylePr>
   </w:style>
-  <w:style w:type="table" w:styleId="789">
+  <w:style w:type="table" w:styleId="790">
     <w:name w:val="List Table 1 Light - Accent 1"/>
-    <w:basedOn w:val="731"/>
+    <w:basedOn w:val="732"/>
     <w:uiPriority w:val="99"/>
     <w:pPr>
       <w:pBdr/>
@@ -27073,9 +27157,9 @@
       </w:tcPr>
     </w:tblStylePr>
   </w:style>
-  <w:style w:type="table" w:styleId="790">
+  <w:style w:type="table" w:styleId="791">
     <w:name w:val="List Table 1 Light - Accent 2"/>
-    <w:basedOn w:val="731"/>
+    <w:basedOn w:val="732"/>
     <w:uiPriority w:val="99"/>
     <w:pPr>
       <w:pBdr/>
@@ -27289,9 +27373,9 @@
       </w:tcPr>
     </w:tblStylePr>
   </w:style>
-  <w:style w:type="table" w:styleId="791">
+  <w:style w:type="table" w:styleId="792">
     <w:name w:val="List Table 1 Light - Accent 3"/>
-    <w:basedOn w:val="731"/>
+    <w:basedOn w:val="732"/>
     <w:uiPriority w:val="99"/>
     <w:pPr>
       <w:pBdr/>
@@ -27505,9 +27589,9 @@
       </w:tcPr>
     </w:tblStylePr>
   </w:style>
-  <w:style w:type="table" w:styleId="792">
+  <w:style w:type="table" w:styleId="793">
     <w:name w:val="List Table 1 Light - Accent 4"/>
-    <w:basedOn w:val="731"/>
+    <w:basedOn w:val="732"/>
     <w:uiPriority w:val="99"/>
     <w:pPr>
       <w:pBdr/>
@@ -27721,9 +27805,9 @@
       </w:tcPr>
     </w:tblStylePr>
   </w:style>
-  <w:style w:type="table" w:styleId="793">
+  <w:style w:type="table" w:styleId="794">
     <w:name w:val="List Table 1 Light - Accent 5"/>
-    <w:basedOn w:val="731"/>
+    <w:basedOn w:val="732"/>
     <w:uiPriority w:val="99"/>
     <w:pPr>
       <w:pBdr/>
@@ -27937,9 +28021,9 @@
       </w:tcPr>
     </w:tblStylePr>
   </w:style>
-  <w:style w:type="table" w:styleId="794">
+  <w:style w:type="table" w:styleId="795">
     <w:name w:val="List Table 1 Light - Accent 6"/>
-    <w:basedOn w:val="731"/>
+    <w:basedOn w:val="732"/>
     <w:uiPriority w:val="99"/>
     <w:pPr>
       <w:pBdr/>
@@ -28153,9 +28237,9 @@
       </w:tcPr>
     </w:tblStylePr>
   </w:style>
-  <w:style w:type="table" w:styleId="795">
+  <w:style w:type="table" w:styleId="796">
     <w:name w:val="List Table 2"/>
-    <w:basedOn w:val="731"/>
+    <w:basedOn w:val="732"/>
     <w:uiPriority w:val="99"/>
     <w:pPr>
       <w:pBdr/>
@@ -28391,9 +28475,9 @@
       </w:tcPr>
     </w:tblStylePr>
   </w:style>
-  <w:style w:type="table" w:styleId="796">
+  <w:style w:type="table" w:styleId="797">
     <w:name w:val="List Table 2 - Accent 1"/>
-    <w:basedOn w:val="731"/>
+    <w:basedOn w:val="732"/>
     <w:uiPriority w:val="99"/>
     <w:pPr>
       <w:pBdr/>
@@ -28629,9 +28713,9 @@
       </w:tcPr>
     </w:tblStylePr>
   </w:style>
-  <w:style w:type="table" w:styleId="797">
+  <w:style w:type="table" w:styleId="798">
     <w:name w:val="List Table 2 - Accent 2"/>
-    <w:basedOn w:val="731"/>
+    <w:basedOn w:val="732"/>
     <w:uiPriority w:val="99"/>
     <w:pPr>
       <w:pBdr/>
@@ -28867,9 +28951,9 @@
       </w:tcPr>
     </w:tblStylePr>
   </w:style>
-  <w:style w:type="table" w:styleId="798">
+  <w:style w:type="table" w:styleId="799">
     <w:name w:val="List Table 2 - Accent 3"/>
-    <w:basedOn w:val="731"/>
+    <w:basedOn w:val="732"/>
     <w:uiPriority w:val="99"/>
     <w:pPr>
       <w:pBdr/>
@@ -29105,9 +29189,9 @@
       </w:tcPr>
     </w:tblStylePr>
   </w:style>
-  <w:style w:type="table" w:styleId="799">
+  <w:style w:type="table" w:styleId="800">
     <w:name w:val="List Table 2 - Accent 4"/>
-    <w:basedOn w:val="731"/>
+    <w:basedOn w:val="732"/>
     <w:uiPriority w:val="99"/>
     <w:pPr>
       <w:pBdr/>
@@ -29343,9 +29427,9 @@
       </w:tcPr>
     </w:tblStylePr>
   </w:style>
-  <w:style w:type="table" w:styleId="800">
+  <w:style w:type="table" w:styleId="801">
     <w:name w:val="List Table 2 - Accent 5"/>
-    <w:basedOn w:val="731"/>
+    <w:basedOn w:val="732"/>
     <w:uiPriority w:val="99"/>
     <w:pPr>
       <w:pBdr/>
@@ -29581,9 +29665,9 @@
       </w:tcPr>
     </w:tblStylePr>
   </w:style>
-  <w:style w:type="table" w:styleId="801">
+  <w:style w:type="table" w:styleId="802">
     <w:name w:val="List Table 2 - Accent 6"/>
-    <w:basedOn w:val="731"/>
+    <w:basedOn w:val="732"/>
     <w:uiPriority w:val="99"/>
     <w:pPr>
       <w:pBdr/>
@@ -29819,9 +29903,9 @@
       </w:tcPr>
     </w:tblStylePr>
   </w:style>
-  <w:style w:type="table" w:styleId="802">
+  <w:style w:type="table" w:styleId="803">
     <w:name w:val="List Table 3"/>
-    <w:basedOn w:val="731"/>
+    <w:basedOn w:val="732"/>
     <w:uiPriority w:val="99"/>
     <w:pPr>
       <w:pBdr/>
@@ -30047,9 +30131,9 @@
       </w:tcPr>
     </w:tblStylePr>
   </w:style>
-  <w:style w:type="table" w:styleId="803">
+  <w:style w:type="table" w:styleId="804">
     <w:name w:val="List Table 3 - Accent 1"/>
-    <w:basedOn w:val="731"/>
+    <w:basedOn w:val="732"/>
     <w:uiPriority w:val="99"/>
     <w:pPr>
       <w:pBdr/>
@@ -30275,9 +30359,9 @@
       </w:tcPr>
     </w:tblStylePr>
   </w:style>
-  <w:style w:type="table" w:styleId="804">
+  <w:style w:type="table" w:styleId="805">
     <w:name w:val="List Table 3 - Accent 2"/>
-    <w:basedOn w:val="731"/>
+    <w:basedOn w:val="732"/>
     <w:uiPriority w:val="99"/>
     <w:pPr>
       <w:pBdr/>
@@ -30503,9 +30587,9 @@
       </w:tcPr>
     </w:tblStylePr>
   </w:style>
-  <w:style w:type="table" w:styleId="805">
+  <w:style w:type="table" w:styleId="806">
     <w:name w:val="List Table 3 - Accent 3"/>
-    <w:basedOn w:val="731"/>
+    <w:basedOn w:val="732"/>
     <w:uiPriority w:val="99"/>
     <w:pPr>
       <w:pBdr/>
@@ -30731,9 +30815,9 @@
       </w:tcPr>
     </w:tblStylePr>
   </w:style>
-  <w:style w:type="table" w:styleId="806">
+  <w:style w:type="table" w:styleId="807">
     <w:name w:val="List Table 3 - Accent 4"/>
-    <w:basedOn w:val="731"/>
+    <w:basedOn w:val="732"/>
     <w:uiPriority w:val="99"/>
     <w:pPr>
       <w:pBdr/>
@@ -30959,9 +31043,9 @@
       </w:tcPr>
     </w:tblStylePr>
   </w:style>
-  <w:style w:type="table" w:styleId="807">
+  <w:style w:type="table" w:styleId="808">
     <w:name w:val="List Table 3 - Accent 5"/>
-    <w:basedOn w:val="731"/>
+    <w:basedOn w:val="732"/>
     <w:uiPriority w:val="99"/>
     <w:pPr>
       <w:pBdr/>
@@ -31187,9 +31271,9 @@
       </w:tcPr>
     </w:tblStylePr>
   </w:style>
-  <w:style w:type="table" w:styleId="808">
+  <w:style w:type="table" w:styleId="809">
     <w:name w:val="List Table 3 - Accent 6"/>
-    <w:basedOn w:val="731"/>
+    <w:basedOn w:val="732"/>
     <w:uiPriority w:val="99"/>
     <w:pPr>
       <w:pBdr/>
@@ -31415,9 +31499,9 @@
       </w:tcPr>
     </w:tblStylePr>
   </w:style>
-  <w:style w:type="table" w:styleId="809">
+  <w:style w:type="table" w:styleId="810">
     <w:name w:val="List Table 4"/>
-    <w:basedOn w:val="731"/>
+    <w:basedOn w:val="732"/>
     <w:uiPriority w:val="99"/>
     <w:pPr>
       <w:pBdr/>
@@ -31640,9 +31724,9 @@
       </w:tcPr>
     </w:tblStylePr>
   </w:style>
-  <w:style w:type="table" w:styleId="810">
+  <w:style w:type="table" w:styleId="811">
     <w:name w:val="List Table 4 - Accent 1"/>
-    <w:basedOn w:val="731"/>
+    <w:basedOn w:val="732"/>
     <w:uiPriority w:val="99"/>
     <w:pPr>
       <w:pBdr/>
@@ -31865,9 +31949,9 @@
       </w:tcPr>
     </w:tblStylePr>
   </w:style>
-  <w:style w:type="table" w:styleId="811">
+  <w:style w:type="table" w:styleId="812">
     <w:name w:val="List Table 4 - Accent 2"/>
-    <w:basedOn w:val="731"/>
+    <w:basedOn w:val="732"/>
     <w:uiPriority w:val="99"/>
     <w:pPr>
       <w:pBdr/>
@@ -32090,9 +32174,9 @@
       </w:tcPr>
     </w:tblStylePr>
   </w:style>
-  <w:style w:type="table" w:styleId="812">
+  <w:style w:type="table" w:styleId="813">
     <w:name w:val="List Table 4 - Accent 3"/>
-    <w:basedOn w:val="731"/>
+    <w:basedOn w:val="732"/>
     <w:uiPriority w:val="99"/>
     <w:pPr>
       <w:pBdr/>
@@ -32315,9 +32399,9 @@
       </w:tcPr>
     </w:tblStylePr>
   </w:style>
-  <w:style w:type="table" w:styleId="813">
+  <w:style w:type="table" w:styleId="814">
     <w:name w:val="List Table 4 - Accent 4"/>
-    <w:basedOn w:val="731"/>
+    <w:basedOn w:val="732"/>
     <w:uiPriority w:val="99"/>
     <w:pPr>
       <w:pBdr/>
@@ -32540,9 +32624,9 @@
       </w:tcPr>
     </w:tblStylePr>
   </w:style>
-  <w:style w:type="table" w:styleId="814">
+  <w:style w:type="table" w:styleId="815">
     <w:name w:val="List Table 4 - Accent 5"/>
-    <w:basedOn w:val="731"/>
+    <w:basedOn w:val="732"/>
     <w:uiPriority w:val="99"/>
     <w:pPr>
       <w:pBdr/>
@@ -32765,9 +32849,9 @@
       </w:tcPr>
     </w:tblStylePr>
   </w:style>
-  <w:style w:type="table" w:styleId="815">
+  <w:style w:type="table" w:styleId="816">
     <w:name w:val="List Table 4 - Accent 6"/>
-    <w:basedOn w:val="731"/>
+    <w:basedOn w:val="732"/>
     <w:uiPriority w:val="99"/>
     <w:pPr>
       <w:pBdr/>
@@ -32990,9 +33074,9 @@
       </w:tcPr>
     </w:tblStylePr>
   </w:style>
-  <w:style w:type="table" w:styleId="816">
+  <w:style w:type="table" w:styleId="817">
     <w:name w:val="List Table 5 Dark"/>
-    <w:basedOn w:val="731"/>
+    <w:basedOn w:val="732"/>
     <w:uiPriority w:val="99"/>
     <w:pPr>
       <w:pBdr/>
@@ -33232,9 +33316,9 @@
       </w:tcPr>
     </w:tblStylePr>
   </w:style>
-  <w:style w:type="table" w:styleId="817">
+  <w:style w:type="table" w:styleId="818">
     <w:name w:val="List Table 5 Dark - Accent 1"/>
-    <w:basedOn w:val="731"/>
+    <w:basedOn w:val="732"/>
     <w:uiPriority w:val="99"/>
     <w:pPr>
       <w:pBdr/>
@@ -33474,9 +33558,9 @@
       </w:tcPr>
     </w:tblStylePr>
   </w:style>
-  <w:style w:type="table" w:styleId="818">
+  <w:style w:type="table" w:styleId="819">
     <w:name w:val="List Table 5 Dark - Accent 2"/>
-    <w:basedOn w:val="731"/>
+    <w:basedOn w:val="732"/>
     <w:uiPriority w:val="99"/>
     <w:pPr>
       <w:pBdr/>
@@ -33716,9 +33800,9 @@
       </w:tcPr>
     </w:tblStylePr>
   </w:style>
-  <w:style w:type="table" w:styleId="819">
+  <w:style w:type="table" w:styleId="820">
     <w:name w:val="List Table 5 Dark - Accent 3"/>
-    <w:basedOn w:val="731"/>
+    <w:basedOn w:val="732"/>
     <w:uiPriority w:val="99"/>
     <w:pPr>
       <w:pBdr/>
@@ -33958,9 +34042,9 @@
       </w:tcPr>
     </w:tblStylePr>
   </w:style>
-  <w:style w:type="table" w:styleId="820">
+  <w:style w:type="table" w:styleId="821">
     <w:name w:val="List Table 5 Dark - Accent 4"/>
-    <w:basedOn w:val="731"/>
+    <w:basedOn w:val="732"/>
     <w:uiPriority w:val="99"/>
     <w:pPr>
       <w:pBdr/>
@@ -34200,9 +34284,9 @@
       </w:tcPr>
     </w:tblStylePr>
   </w:style>
-  <w:style w:type="table" w:styleId="821">
+  <w:style w:type="table" w:styleId="822">
     <w:name w:val="List Table 5 Dark - Accent 5"/>
-    <w:basedOn w:val="731"/>
+    <w:basedOn w:val="732"/>
     <w:uiPriority w:val="99"/>
     <w:pPr>
       <w:pBdr/>
@@ -34442,9 +34526,9 @@
       </w:tcPr>
     </w:tblStylePr>
   </w:style>
-  <w:style w:type="table" w:styleId="822">
+  <w:style w:type="table" w:styleId="823">
     <w:name w:val="List Table 5 Dark - Accent 6"/>
-    <w:basedOn w:val="731"/>
+    <w:basedOn w:val="732"/>
     <w:uiPriority w:val="99"/>
     <w:pPr>
       <w:pBdr/>
@@ -34684,9 +34768,9 @@
       </w:tcPr>
     </w:tblStylePr>
   </w:style>
-  <w:style w:type="table" w:styleId="823">
+  <w:style w:type="table" w:styleId="824">
     <w:name w:val="List Table 6 Colorful"/>
-    <w:basedOn w:val="731"/>
+    <w:basedOn w:val="732"/>
     <w:uiPriority w:val="99"/>
     <w:pPr>
       <w:pBdr/>
@@ -34907,9 +34991,9 @@
       </w:tcPr>
     </w:tblStylePr>
   </w:style>
-  <w:style w:type="table" w:styleId="824">
+  <w:style w:type="table" w:styleId="825">
     <w:name w:val="List Table 6 Colorful - Accent 1"/>
-    <w:basedOn w:val="731"/>
+    <w:basedOn w:val="732"/>
     <w:uiPriority w:val="99"/>
     <w:pPr>
       <w:pBdr/>
@@ -35130,9 +35214,9 @@
       </w:tcPr>
     </w:tblStylePr>
   </w:style>
-  <w:style w:type="table" w:styleId="825">
+  <w:style w:type="table" w:styleId="826">
     <w:name w:val="List Table 6 Colorful - Accent 2"/>
-    <w:basedOn w:val="731"/>
+    <w:basedOn w:val="732"/>
     <w:uiPriority w:val="99"/>
     <w:pPr>
       <w:pBdr/>
@@ -35353,9 +35437,9 @@
       </w:tcPr>
     </w:tblStylePr>
   </w:style>
-  <w:style w:type="table" w:styleId="826">
+  <w:style w:type="table" w:styleId="827">
     <w:name w:val="List Table 6 Colorful - Accent 3"/>
-    <w:basedOn w:val="731"/>
+    <w:basedOn w:val="732"/>
     <w:uiPriority w:val="99"/>
     <w:pPr>
       <w:pBdr/>
@@ -35576,9 +35660,9 @@
       </w:tcPr>
     </w:tblStylePr>
   </w:style>
-  <w:style w:type="table" w:styleId="827">
+  <w:style w:type="table" w:styleId="828">
     <w:name w:val="List Table 6 Colorful - Accent 4"/>
-    <w:basedOn w:val="731"/>
+    <w:basedOn w:val="732"/>
     <w:uiPriority w:val="99"/>
     <w:pPr>
       <w:pBdr/>
@@ -35799,9 +35883,9 @@
       </w:tcPr>
     </w:tblStylePr>
   </w:style>
-  <w:style w:type="table" w:styleId="828">
+  <w:style w:type="table" w:styleId="829">
     <w:name w:val="List Table 6 Colorful - Accent 5"/>
-    <w:basedOn w:val="731"/>
+    <w:basedOn w:val="732"/>
     <w:uiPriority w:val="99"/>
     <w:pPr>
       <w:pBdr/>
@@ -36022,9 +36106,9 @@
       </w:tcPr>
     </w:tblStylePr>
   </w:style>
-  <w:style w:type="table" w:styleId="829">
+  <w:style w:type="table" w:styleId="830">
     <w:name w:val="List Table 6 Colorful - Accent 6"/>
-    <w:basedOn w:val="731"/>
+    <w:basedOn w:val="732"/>
     <w:uiPriority w:val="99"/>
     <w:pPr>
       <w:pBdr/>
@@ -36245,9 +36329,9 @@
       </w:tcPr>
     </w:tblStylePr>
   </w:style>
-  <w:style w:type="table" w:styleId="830">
+  <w:style w:type="table" w:styleId="831">
     <w:name w:val="List Table 7 Colorful"/>
-    <w:basedOn w:val="731"/>
+    <w:basedOn w:val="732"/>
     <w:uiPriority w:val="99"/>
     <w:pPr>
       <w:pBdr/>
@@ -36501,9 +36585,9 @@
       </w:tcPr>
     </w:tblStylePr>
   </w:style>
-  <w:style w:type="table" w:styleId="831">
+  <w:style w:type="table" w:styleId="832">
     <w:name w:val="List Table 7 Colorful - Accent 1"/>
-    <w:basedOn w:val="731"/>
+    <w:basedOn w:val="732"/>
     <w:uiPriority w:val="99"/>
     <w:pPr>
       <w:pBdr/>
@@ -36757,9 +36841,9 @@
       </w:tcPr>
     </w:tblStylePr>
   </w:style>
-  <w:style w:type="table" w:styleId="832">
+  <w:style w:type="table" w:styleId="833">
     <w:name w:val="List Table 7 Colorful - Accent 2"/>
-    <w:basedOn w:val="731"/>
+    <w:basedOn w:val="732"/>
     <w:uiPriority w:val="99"/>
     <w:pPr>
       <w:pBdr/>
@@ -37013,9 +37097,9 @@
       </w:tcPr>
     </w:tblStylePr>
   </w:style>
-  <w:style w:type="table" w:styleId="833">
+  <w:style w:type="table" w:styleId="834">
     <w:name w:val="List Table 7 Colorful - Accent 3"/>
-    <w:basedOn w:val="731"/>
+    <w:basedOn w:val="732"/>
     <w:uiPriority w:val="99"/>
     <w:pPr>
       <w:pBdr/>
@@ -37269,9 +37353,9 @@
       </w:tcPr>
     </w:tblStylePr>
   </w:style>
-  <w:style w:type="table" w:styleId="834">
+  <w:style w:type="table" w:styleId="835">
     <w:name w:val="List Table 7 Colorful - Accent 4"/>
-    <w:basedOn w:val="731"/>
+    <w:basedOn w:val="732"/>
     <w:uiPriority w:val="99"/>
     <w:pPr>
       <w:pBdr/>
@@ -37525,9 +37609,9 @@
       </w:tcPr>
     </w:tblStylePr>
   </w:style>
-  <w:style w:type="table" w:styleId="835">
+  <w:style w:type="table" w:styleId="836">
     <w:name w:val="List Table 7 Colorful - Accent 5"/>
-    <w:basedOn w:val="731"/>
+    <w:basedOn w:val="732"/>
     <w:uiPriority w:val="99"/>
     <w:pPr>
       <w:pBdr/>
@@ -37781,9 +37865,9 @@
       </w:tcPr>
     </w:tblStylePr>
   </w:style>
-  <w:style w:type="table" w:styleId="836">
+  <w:style w:type="table" w:styleId="837">
     <w:name w:val="List Table 7 Colorful - Accent 6"/>
-    <w:basedOn w:val="731"/>
+    <w:basedOn w:val="732"/>
     <w:uiPriority w:val="99"/>
     <w:pPr>
       <w:pBdr/>
@@ -38037,9 +38121,9 @@
       </w:tcPr>
     </w:tblStylePr>
   </w:style>
-  <w:style w:type="table" w:styleId="837">
+  <w:style w:type="table" w:styleId="838">
     <w:name w:val="Lined - Accent"/>
-    <w:basedOn w:val="731"/>
+    <w:basedOn w:val="732"/>
     <w:uiPriority w:val="99"/>
     <w:pPr>
       <w:pBdr/>
@@ -38274,9 +38358,9 @@
       </w:tcPr>
     </w:tblStylePr>
   </w:style>
-  <w:style w:type="table" w:styleId="838">
+  <w:style w:type="table" w:styleId="839">
     <w:name w:val="Lined - Accent 1"/>
-    <w:basedOn w:val="731"/>
+    <w:basedOn w:val="732"/>
     <w:uiPriority w:val="99"/>
     <w:pPr>
       <w:pBdr/>
@@ -38511,9 +38595,9 @@
       </w:tcPr>
     </w:tblStylePr>
   </w:style>
-  <w:style w:type="table" w:styleId="839">
+  <w:style w:type="table" w:styleId="840">
     <w:name w:val="Lined - Accent 2"/>
-    <w:basedOn w:val="731"/>
+    <w:basedOn w:val="732"/>
     <w:uiPriority w:val="99"/>
     <w:pPr>
       <w:pBdr/>
@@ -38748,9 +38832,9 @@
       </w:tcPr>
     </w:tblStylePr>
   </w:style>
-  <w:style w:type="table" w:styleId="840">
+  <w:style w:type="table" w:styleId="841">
     <w:name w:val="Lined - Accent 3"/>
-    <w:basedOn w:val="731"/>
+    <w:basedOn w:val="732"/>
     <w:uiPriority w:val="99"/>
     <w:pPr>
       <w:pBdr/>
@@ -38985,9 +39069,9 @@
       </w:tcPr>
     </w:tblStylePr>
   </w:style>
-  <w:style w:type="table" w:styleId="841">
+  <w:style w:type="table" w:styleId="842">
     <w:name w:val="Lined - Accent 4"/>
-    <w:basedOn w:val="731"/>
+    <w:basedOn w:val="732"/>
     <w:uiPriority w:val="99"/>
     <w:pPr>
       <w:pBdr/>
@@ -39222,9 +39306,9 @@
       </w:tcPr>
     </w:tblStylePr>
   </w:style>
-  <w:style w:type="table" w:styleId="842">
+  <w:style w:type="table" w:styleId="843">
     <w:name w:val="Lined - Accent 5"/>
-    <w:basedOn w:val="731"/>
+    <w:basedOn w:val="732"/>
     <w:uiPriority w:val="99"/>
     <w:pPr>
       <w:pBdr/>
@@ -39459,9 +39543,9 @@
       </w:tcPr>
     </w:tblStylePr>
   </w:style>
-  <w:style w:type="table" w:styleId="843">
+  <w:style w:type="table" w:styleId="844">
     <w:name w:val="Lined - Accent 6"/>
-    <w:basedOn w:val="731"/>
+    <w:basedOn w:val="732"/>
     <w:uiPriority w:val="99"/>
     <w:pPr>
       <w:pBdr/>
@@ -39696,9 +39780,9 @@
       </w:tcPr>
     </w:tblStylePr>
   </w:style>
-  <w:style w:type="table" w:styleId="844">
+  <w:style w:type="table" w:styleId="845">
     <w:name w:val="Bordered &amp; Lined - Accent"/>
-    <w:basedOn w:val="731"/>
+    <w:basedOn w:val="732"/>
     <w:uiPriority w:val="99"/>
     <w:pPr>
       <w:pBdr/>
@@ -39940,9 +40024,9 @@
       </w:tcPr>
     </w:tblStylePr>
   </w:style>
-  <w:style w:type="table" w:styleId="845">
+  <w:style w:type="table" w:styleId="846">
     <w:name w:val="Bordered &amp; Lined - Accent 1"/>
-    <w:basedOn w:val="731"/>
+    <w:basedOn w:val="732"/>
     <w:uiPriority w:val="99"/>
     <w:pPr>
       <w:pBdr/>
@@ -40184,9 +40268,9 @@
       </w:tcPr>
     </w:tblStylePr>
   </w:style>
-  <w:style w:type="table" w:styleId="846">
+  <w:style w:type="table" w:styleId="847">
     <w:name w:val="Bordered &amp; Lined - Accent 2"/>
-    <w:basedOn w:val="731"/>
+    <w:basedOn w:val="732"/>
     <w:uiPriority w:val="99"/>
     <w:pPr>
       <w:pBdr/>
@@ -40428,9 +40512,9 @@
       </w:tcPr>
     </w:tblStylePr>
   </w:style>
-  <w:style w:type="table" w:styleId="847">
+  <w:style w:type="table" w:styleId="848">
     <w:name w:val="Bordered &amp; Lined - Accent 3"/>
-    <w:basedOn w:val="731"/>
+    <w:basedOn w:val="732"/>
     <w:uiPriority w:val="99"/>
     <w:pPr>
       <w:pBdr/>
@@ -40672,9 +40756,9 @@
       </w:tcPr>
     </w:tblStylePr>
   </w:style>
-  <w:style w:type="table" w:styleId="848">
+  <w:style w:type="table" w:styleId="849">
     <w:name w:val="Bordered &amp; Lined - Accent 4"/>
-    <w:basedOn w:val="731"/>
+    <w:basedOn w:val="732"/>
     <w:uiPriority w:val="99"/>
     <w:pPr>
       <w:pBdr/>
@@ -40916,9 +41000,9 @@
       </w:tcPr>
     </w:tblStylePr>
   </w:style>
-  <w:style w:type="table" w:styleId="849">
+  <w:style w:type="table" w:styleId="850">
     <w:name w:val="Bordered &amp; Lined - Accent 5"/>
-    <w:basedOn w:val="731"/>
+    <w:basedOn w:val="732"/>
     <w:uiPriority w:val="99"/>
     <w:pPr>
       <w:pBdr/>
@@ -41160,9 +41244,9 @@
       </w:tcPr>
     </w:tblStylePr>
   </w:style>
-  <w:style w:type="table" w:styleId="850">
+  <w:style w:type="table" w:styleId="851">
     <w:name w:val="Bordered &amp; Lined - Accent 6"/>
-    <w:basedOn w:val="731"/>
+    <w:basedOn w:val="732"/>
     <w:uiPriority w:val="99"/>
     <w:pPr>
       <w:pBdr/>
@@ -41404,9 +41488,9 @@
       </w:tcPr>
     </w:tblStylePr>
   </w:style>
-  <w:style w:type="table" w:styleId="851">
+  <w:style w:type="table" w:styleId="852">
     <w:name w:val="Bordered"/>
-    <w:basedOn w:val="731"/>
+    <w:basedOn w:val="732"/>
     <w:uiPriority w:val="99"/>
     <w:pPr>
       <w:pBdr/>
@@ -41635,9 +41719,9 @@
       </w:tcPr>
     </w:tblStylePr>
   </w:style>
-  <w:style w:type="table" w:styleId="852">
+  <w:style w:type="table" w:styleId="853">
     <w:name w:val="Bordered - Accent 1"/>
-    <w:basedOn w:val="731"/>
+    <w:basedOn w:val="732"/>
     <w:uiPriority w:val="99"/>
     <w:pPr>
       <w:pBdr/>
@@ -41866,9 +41950,9 @@
       </w:tcPr>
     </w:tblStylePr>
   </w:style>
-  <w:style w:type="table" w:styleId="853">
+  <w:style w:type="table" w:styleId="854">
     <w:name w:val="Bordered - Accent 2"/>
-    <w:basedOn w:val="731"/>
+    <w:basedOn w:val="732"/>
     <w:uiPriority w:val="99"/>
     <w:pPr>
       <w:pBdr/>
@@ -42097,9 +42181,9 @@
       </w:tcPr>
     </w:tblStylePr>
   </w:style>
-  <w:style w:type="table" w:styleId="854">
+  <w:style w:type="table" w:styleId="855">
     <w:name w:val="Bordered - Accent 3"/>
-    <w:basedOn w:val="731"/>
+    <w:basedOn w:val="732"/>
     <w:uiPriority w:val="99"/>
     <w:pPr>
       <w:pBdr/>
@@ -42328,9 +42412,9 @@
       </w:tcPr>
     </w:tblStylePr>
   </w:style>
-  <w:style w:type="table" w:styleId="855">
+  <w:style w:type="table" w:styleId="856">
     <w:name w:val="Bordered - Accent 4"/>
-    <w:basedOn w:val="731"/>
+    <w:basedOn w:val="732"/>
     <w:uiPriority w:val="99"/>
     <w:pPr>
       <w:pBdr/>
@@ -42559,9 +42643,9 @@
       </w:tcPr>
     </w:tblStylePr>
   </w:style>
-  <w:style w:type="table" w:styleId="856">
+  <w:style w:type="table" w:styleId="857">
     <w:name w:val="Bordered - Accent 5"/>
-    <w:basedOn w:val="731"/>
+    <w:basedOn w:val="732"/>
     <w:uiPriority w:val="99"/>
     <w:pPr>
       <w:pBdr/>
@@ -42790,9 +42874,9 @@
       </w:tcPr>
     </w:tblStylePr>
   </w:style>
-  <w:style w:type="table" w:styleId="857">
+  <w:style w:type="table" w:styleId="858">
     <w:name w:val="Bordered - Accent 6"/>
-    <w:basedOn w:val="731"/>
+    <w:basedOn w:val="732"/>
     <w:uiPriority w:val="99"/>
     <w:pPr>
       <w:pBdr/>
@@ -43021,7 +43105,7 @@
       </w:tcPr>
     </w:tblStylePr>
   </w:style>
-  <w:style w:type="paragraph" w:styleId="858" w:default="1">
+  <w:style w:type="paragraph" w:styleId="859" w:default="1">
     <w:name w:val="Normal"/>
     <w:qFormat/>
     <w:pPr>
@@ -43030,11 +43114,11 @@
       <w:ind/>
     </w:pPr>
   </w:style>
-  <w:style w:type="paragraph" w:styleId="859">
+  <w:style w:type="paragraph" w:styleId="860">
     <w:name w:val="Heading 7"/>
-    <w:basedOn w:val="858"/>
-    <w:next w:val="858"/>
-    <w:link w:val="870"/>
+    <w:basedOn w:val="859"/>
+    <w:next w:val="859"/>
+    <w:link w:val="871"/>
     <w:uiPriority w:val="9"/>
     <w:unhideWhenUsed/>
     <w:qFormat/>
@@ -43051,11 +43135,11 @@
       <w:color w:val="595959" w:themeColor="text1" w:themeTint="A6"/>
     </w:rPr>
   </w:style>
-  <w:style w:type="paragraph" w:styleId="860">
+  <w:style w:type="paragraph" w:styleId="861">
     <w:name w:val="Heading 8"/>
-    <w:basedOn w:val="858"/>
-    <w:next w:val="858"/>
-    <w:link w:val="871"/>
+    <w:basedOn w:val="859"/>
+    <w:next w:val="859"/>
+    <w:link w:val="872"/>
     <w:uiPriority w:val="9"/>
     <w:unhideWhenUsed/>
     <w:qFormat/>
@@ -43074,11 +43158,11 @@
       <w:color w:val="272727" w:themeColor="text1" w:themeTint="D8"/>
     </w:rPr>
   </w:style>
-  <w:style w:type="paragraph" w:styleId="861">
+  <w:style w:type="paragraph" w:styleId="862">
     <w:name w:val="Heading 9"/>
-    <w:basedOn w:val="858"/>
-    <w:next w:val="858"/>
-    <w:link w:val="872"/>
+    <w:basedOn w:val="859"/>
+    <w:next w:val="859"/>
+    <w:link w:val="873"/>
     <w:uiPriority w:val="9"/>
     <w:unhideWhenUsed/>
     <w:qFormat/>
@@ -43097,7 +43181,7 @@
       <w:color w:val="272727" w:themeColor="text1" w:themeTint="D8"/>
     </w:rPr>
   </w:style>
-  <w:style w:type="character" w:styleId="862" w:default="1">
+  <w:style w:type="character" w:styleId="863" w:default="1">
     <w:name w:val="Default Paragraph Font"/>
     <w:uiPriority w:val="1"/>
     <w:semiHidden/>
@@ -43108,7 +43192,7 @@
       <w:ind/>
     </w:pPr>
   </w:style>
-  <w:style w:type="numbering" w:styleId="863" w:default="1">
+  <w:style w:type="numbering" w:styleId="864" w:default="1">
     <w:name w:val="No List"/>
     <w:uiPriority w:val="99"/>
     <w:semiHidden/>
@@ -43119,10 +43203,10 @@
       <w:ind/>
     </w:pPr>
   </w:style>
-  <w:style w:type="character" w:styleId="864">
+  <w:style w:type="character" w:styleId="865">
     <w:name w:val="Heading 1 Char"/>
-    <w:basedOn w:val="862"/>
-    <w:link w:val="918"/>
+    <w:basedOn w:val="863"/>
+    <w:link w:val="919"/>
     <w:uiPriority w:val="9"/>
     <w:pPr>
       <w:pBdr/>
@@ -43136,10 +43220,10 @@
       <w:szCs w:val="40"/>
     </w:rPr>
   </w:style>
-  <w:style w:type="character" w:styleId="865">
+  <w:style w:type="character" w:styleId="866">
     <w:name w:val="Heading 2 Char"/>
-    <w:basedOn w:val="862"/>
-    <w:link w:val="919"/>
+    <w:basedOn w:val="863"/>
+    <w:link w:val="920"/>
     <w:uiPriority w:val="9"/>
     <w:pPr>
       <w:pBdr/>
@@ -43153,10 +43237,10 @@
       <w:szCs w:val="32"/>
     </w:rPr>
   </w:style>
-  <w:style w:type="character" w:styleId="866">
+  <w:style w:type="character" w:styleId="867">
     <w:name w:val="Heading 3 Char"/>
-    <w:basedOn w:val="862"/>
-    <w:link w:val="920"/>
+    <w:basedOn w:val="863"/>
+    <w:link w:val="921"/>
     <w:uiPriority w:val="9"/>
     <w:pPr>
       <w:pBdr/>
@@ -43170,10 +43254,10 @@
       <w:szCs w:val="28"/>
     </w:rPr>
   </w:style>
-  <w:style w:type="character" w:styleId="867">
+  <w:style w:type="character" w:styleId="868">
     <w:name w:val="Heading 4 Char"/>
-    <w:basedOn w:val="862"/>
-    <w:link w:val="906"/>
+    <w:basedOn w:val="863"/>
+    <w:link w:val="907"/>
     <w:uiPriority w:val="9"/>
     <w:pPr>
       <w:pBdr/>
@@ -43187,10 +43271,10 @@
       <w:color w:val="0f4761" w:themeColor="accent1" w:themeShade="BF"/>
     </w:rPr>
   </w:style>
-  <w:style w:type="character" w:styleId="868">
+  <w:style w:type="character" w:styleId="869">
     <w:name w:val="Heading 5 Char"/>
-    <w:basedOn w:val="862"/>
-    <w:link w:val="907"/>
+    <w:basedOn w:val="863"/>
+    <w:link w:val="908"/>
     <w:uiPriority w:val="9"/>
     <w:pPr>
       <w:pBdr/>
@@ -43202,10 +43286,10 @@
       <w:color w:val="0f4761" w:themeColor="accent1" w:themeShade="BF"/>
     </w:rPr>
   </w:style>
-  <w:style w:type="character" w:styleId="869">
+  <w:style w:type="character" w:styleId="870">
     <w:name w:val="Heading 6 Char"/>
-    <w:basedOn w:val="862"/>
-    <w:link w:val="908"/>
+    <w:basedOn w:val="863"/>
+    <w:link w:val="909"/>
     <w:uiPriority w:val="9"/>
     <w:pPr>
       <w:pBdr/>
@@ -43219,10 +43303,10 @@
       <w:color w:val="595959" w:themeColor="text1" w:themeTint="A6"/>
     </w:rPr>
   </w:style>
-  <w:style w:type="character" w:styleId="870">
+  <w:style w:type="character" w:styleId="871">
     <w:name w:val="Heading 7 Char"/>
-    <w:basedOn w:val="862"/>
-    <w:link w:val="859"/>
+    <w:basedOn w:val="863"/>
+    <w:link w:val="860"/>
     <w:uiPriority w:val="9"/>
     <w:pPr>
       <w:pBdr/>
@@ -43234,26 +43318,9 @@
       <w:color w:val="595959" w:themeColor="text1" w:themeTint="A6"/>
     </w:rPr>
   </w:style>
-  <w:style w:type="character" w:styleId="871">
+  <w:style w:type="character" w:styleId="872">
     <w:name w:val="Heading 8 Char"/>
-    <w:basedOn w:val="862"/>
-    <w:link w:val="860"/>
-    <w:uiPriority w:val="9"/>
-    <w:pPr>
-      <w:pBdr/>
-      <w:spacing/>
-      <w:ind/>
-    </w:pPr>
-    <w:rPr>
-      <w:rFonts w:ascii="Arial" w:hAnsi="Arial" w:eastAsia="Arial" w:cs="Arial"/>
-      <w:i/>
-      <w:iCs/>
-      <w:color w:val="272727" w:themeColor="text1" w:themeTint="D8"/>
-    </w:rPr>
-  </w:style>
-  <w:style w:type="character" w:styleId="872">
-    <w:name w:val="Heading 9 Char"/>
-    <w:basedOn w:val="862"/>
+    <w:basedOn w:val="863"/>
     <w:link w:val="861"/>
     <w:uiPriority w:val="9"/>
     <w:pPr>
@@ -43269,9 +43336,26 @@
     </w:rPr>
   </w:style>
   <w:style w:type="character" w:styleId="873">
+    <w:name w:val="Heading 9 Char"/>
+    <w:basedOn w:val="863"/>
+    <w:link w:val="862"/>
+    <w:uiPriority w:val="9"/>
+    <w:pPr>
+      <w:pBdr/>
+      <w:spacing/>
+      <w:ind/>
+    </w:pPr>
+    <w:rPr>
+      <w:rFonts w:ascii="Arial" w:hAnsi="Arial" w:eastAsia="Arial" w:cs="Arial"/>
+      <w:i/>
+      <w:iCs/>
+      <w:color w:val="272727" w:themeColor="text1" w:themeTint="D8"/>
+    </w:rPr>
+  </w:style>
+  <w:style w:type="character" w:styleId="874">
     <w:name w:val="Title Char"/>
-    <w:basedOn w:val="862"/>
-    <w:link w:val="905"/>
+    <w:basedOn w:val="863"/>
+    <w:link w:val="906"/>
     <w:uiPriority w:val="10"/>
     <w:pPr>
       <w:pBdr/>
@@ -43285,11 +43369,11 @@
       <w:szCs w:val="56"/>
     </w:rPr>
   </w:style>
-  <w:style w:type="paragraph" w:styleId="874">
+  <w:style w:type="paragraph" w:styleId="875">
     <w:name w:val="Subtitle"/>
-    <w:basedOn w:val="858"/>
-    <w:next w:val="858"/>
-    <w:link w:val="875"/>
+    <w:basedOn w:val="859"/>
+    <w:next w:val="859"/>
+    <w:link w:val="876"/>
     <w:uiPriority w:val="11"/>
     <w:qFormat/>
     <w:pPr>
@@ -43307,10 +43391,10 @@
       <w:szCs w:val="28"/>
     </w:rPr>
   </w:style>
-  <w:style w:type="character" w:styleId="875">
+  <w:style w:type="character" w:styleId="876">
     <w:name w:val="Subtitle Char"/>
-    <w:basedOn w:val="862"/>
-    <w:link w:val="874"/>
+    <w:basedOn w:val="863"/>
+    <w:link w:val="875"/>
     <w:uiPriority w:val="11"/>
     <w:pPr>
       <w:pBdr/>
@@ -43324,11 +43408,11 @@
       <w:szCs w:val="28"/>
     </w:rPr>
   </w:style>
-  <w:style w:type="paragraph" w:styleId="876">
+  <w:style w:type="paragraph" w:styleId="877">
     <w:name w:val="Quote"/>
-    <w:basedOn w:val="858"/>
-    <w:next w:val="858"/>
-    <w:link w:val="877"/>
+    <w:basedOn w:val="859"/>
+    <w:next w:val="859"/>
+    <w:link w:val="878"/>
     <w:uiPriority w:val="29"/>
     <w:qFormat/>
     <w:pPr>
@@ -43343,10 +43427,10 @@
       <w:color w:val="404040" w:themeColor="text1" w:themeTint="BF"/>
     </w:rPr>
   </w:style>
-  <w:style w:type="character" w:styleId="877">
+  <w:style w:type="character" w:styleId="878">
     <w:name w:val="Quote Char"/>
-    <w:basedOn w:val="862"/>
-    <w:link w:val="876"/>
+    <w:basedOn w:val="863"/>
+    <w:link w:val="877"/>
     <w:uiPriority w:val="29"/>
     <w:pPr>
       <w:pBdr/>
@@ -43359,9 +43443,9 @@
       <w:color w:val="404040" w:themeColor="text1" w:themeTint="BF"/>
     </w:rPr>
   </w:style>
-  <w:style w:type="character" w:styleId="878">
+  <w:style w:type="character" w:styleId="879">
     <w:name w:val="Intense Emphasis"/>
-    <w:basedOn w:val="862"/>
+    <w:basedOn w:val="863"/>
     <w:uiPriority w:val="21"/>
     <w:qFormat/>
     <w:pPr>
@@ -43375,11 +43459,11 @@
       <w:color w:val="0f4761" w:themeColor="accent1" w:themeShade="BF"/>
     </w:rPr>
   </w:style>
-  <w:style w:type="paragraph" w:styleId="879">
+  <w:style w:type="paragraph" w:styleId="880">
     <w:name w:val="Intense Quote"/>
-    <w:basedOn w:val="858"/>
-    <w:next w:val="858"/>
-    <w:link w:val="880"/>
+    <w:basedOn w:val="859"/>
+    <w:next w:val="859"/>
+    <w:link w:val="881"/>
     <w:uiPriority w:val="30"/>
     <w:qFormat/>
     <w:pPr>
@@ -43397,10 +43481,10 @@
       <w:color w:val="0f4761" w:themeColor="accent1" w:themeShade="BF"/>
     </w:rPr>
   </w:style>
-  <w:style w:type="character" w:styleId="880">
+  <w:style w:type="character" w:styleId="881">
     <w:name w:val="Intense Quote Char"/>
-    <w:basedOn w:val="862"/>
-    <w:link w:val="879"/>
+    <w:basedOn w:val="863"/>
+    <w:link w:val="880"/>
     <w:uiPriority w:val="30"/>
     <w:pPr>
       <w:pBdr/>
@@ -43413,9 +43497,9 @@
       <w:color w:val="0f4761" w:themeColor="accent1" w:themeShade="BF"/>
     </w:rPr>
   </w:style>
-  <w:style w:type="character" w:styleId="881">
+  <w:style w:type="character" w:styleId="882">
     <w:name w:val="Intense Reference"/>
-    <w:basedOn w:val="862"/>
+    <w:basedOn w:val="863"/>
     <w:uiPriority w:val="32"/>
     <w:qFormat/>
     <w:pPr>
@@ -43431,9 +43515,9 @@
       <w:spacing w:val="5"/>
     </w:rPr>
   </w:style>
-  <w:style w:type="paragraph" w:styleId="882">
+  <w:style w:type="paragraph" w:styleId="883">
     <w:name w:val="No Spacing"/>
-    <w:basedOn w:val="858"/>
+    <w:basedOn w:val="859"/>
     <w:uiPriority w:val="1"/>
     <w:qFormat/>
     <w:pPr>
@@ -43442,9 +43526,9 @@
       <w:ind/>
     </w:pPr>
   </w:style>
-  <w:style w:type="character" w:styleId="883">
+  <w:style w:type="character" w:styleId="884">
     <w:name w:val="Subtle Emphasis"/>
-    <w:basedOn w:val="862"/>
+    <w:basedOn w:val="863"/>
     <w:uiPriority w:val="19"/>
     <w:qFormat/>
     <w:pPr>
@@ -43458,9 +43542,9 @@
       <w:color w:val="404040" w:themeColor="text1" w:themeTint="BF"/>
     </w:rPr>
   </w:style>
-  <w:style w:type="character" w:styleId="884">
+  <w:style w:type="character" w:styleId="885">
     <w:name w:val="Emphasis"/>
-    <w:basedOn w:val="862"/>
+    <w:basedOn w:val="863"/>
     <w:uiPriority w:val="20"/>
     <w:qFormat/>
     <w:pPr>
@@ -43473,9 +43557,9 @@
       <w:iCs/>
     </w:rPr>
   </w:style>
-  <w:style w:type="character" w:styleId="885">
+  <w:style w:type="character" w:styleId="886">
     <w:name w:val="Subtle Reference"/>
-    <w:basedOn w:val="862"/>
+    <w:basedOn w:val="863"/>
     <w:uiPriority w:val="31"/>
     <w:qFormat/>
     <w:pPr>
@@ -43488,9 +43572,9 @@
       <w:color w:val="5a5a5a" w:themeColor="text1" w:themeTint="A5"/>
     </w:rPr>
   </w:style>
-  <w:style w:type="character" w:styleId="886">
+  <w:style w:type="character" w:styleId="887">
     <w:name w:val="Book Title"/>
-    <w:basedOn w:val="862"/>
+    <w:basedOn w:val="863"/>
     <w:uiPriority w:val="33"/>
     <w:qFormat/>
     <w:pPr>
@@ -43506,10 +43590,10 @@
       <w:spacing w:val="5"/>
     </w:rPr>
   </w:style>
-  <w:style w:type="paragraph" w:styleId="887">
+  <w:style w:type="paragraph" w:styleId="888">
     <w:name w:val="Header"/>
-    <w:basedOn w:val="858"/>
-    <w:link w:val="888"/>
+    <w:basedOn w:val="859"/>
+    <w:link w:val="889"/>
     <w:uiPriority w:val="99"/>
     <w:unhideWhenUsed/>
     <w:pPr>
@@ -43522,10 +43606,10 @@
       <w:ind/>
     </w:pPr>
   </w:style>
-  <w:style w:type="character" w:styleId="888">
+  <w:style w:type="character" w:styleId="889">
     <w:name w:val="Header Char"/>
-    <w:basedOn w:val="862"/>
-    <w:link w:val="887"/>
+    <w:basedOn w:val="863"/>
+    <w:link w:val="888"/>
     <w:uiPriority w:val="99"/>
     <w:pPr>
       <w:pBdr/>
@@ -43533,10 +43617,10 @@
       <w:ind/>
     </w:pPr>
   </w:style>
-  <w:style w:type="paragraph" w:styleId="889">
+  <w:style w:type="paragraph" w:styleId="890">
     <w:name w:val="Footer"/>
-    <w:basedOn w:val="858"/>
-    <w:link w:val="890"/>
+    <w:basedOn w:val="859"/>
+    <w:link w:val="891"/>
     <w:uiPriority w:val="99"/>
     <w:unhideWhenUsed/>
     <w:pPr>
@@ -43549,10 +43633,10 @@
       <w:ind/>
     </w:pPr>
   </w:style>
-  <w:style w:type="character" w:styleId="890">
+  <w:style w:type="character" w:styleId="891">
     <w:name w:val="Footer Char"/>
-    <w:basedOn w:val="862"/>
-    <w:link w:val="889"/>
+    <w:basedOn w:val="863"/>
+    <w:link w:val="890"/>
     <w:uiPriority w:val="99"/>
     <w:pPr>
       <w:pBdr/>
@@ -43560,10 +43644,10 @@
       <w:ind/>
     </w:pPr>
   </w:style>
-  <w:style w:type="paragraph" w:styleId="891">
+  <w:style w:type="paragraph" w:styleId="892">
     <w:name w:val="Caption"/>
-    <w:basedOn w:val="858"/>
-    <w:next w:val="858"/>
+    <w:basedOn w:val="859"/>
+    <w:next w:val="859"/>
     <w:uiPriority w:val="35"/>
     <w:unhideWhenUsed/>
     <w:qFormat/>
@@ -43580,9 +43664,9 @@
       <w:szCs w:val="18"/>
     </w:rPr>
   </w:style>
-  <w:style w:type="character" w:styleId="892">
+  <w:style w:type="character" w:styleId="893">
     <w:name w:val="FollowedHyperlink"/>
-    <w:basedOn w:val="862"/>
+    <w:basedOn w:val="863"/>
     <w:uiPriority w:val="99"/>
     <w:semiHidden/>
     <w:unhideWhenUsed/>
@@ -43596,10 +43680,10 @@
       <w:u w:val="single"/>
     </w:rPr>
   </w:style>
-  <w:style w:type="paragraph" w:styleId="893">
+  <w:style w:type="paragraph" w:styleId="894">
     <w:name w:val="toc 1"/>
-    <w:basedOn w:val="858"/>
-    <w:next w:val="858"/>
+    <w:basedOn w:val="859"/>
+    <w:next w:val="859"/>
     <w:uiPriority w:val="39"/>
     <w:unhideWhenUsed/>
     <w:pPr>
@@ -43608,10 +43692,10 @@
       <w:ind/>
     </w:pPr>
   </w:style>
-  <w:style w:type="paragraph" w:styleId="894">
+  <w:style w:type="paragraph" w:styleId="895">
     <w:name w:val="toc 2"/>
-    <w:basedOn w:val="858"/>
-    <w:next w:val="858"/>
+    <w:basedOn w:val="859"/>
+    <w:next w:val="859"/>
     <w:uiPriority w:val="39"/>
     <w:unhideWhenUsed/>
     <w:pPr>
@@ -43620,10 +43704,10 @@
       <w:ind w:left="220"/>
     </w:pPr>
   </w:style>
-  <w:style w:type="paragraph" w:styleId="895">
+  <w:style w:type="paragraph" w:styleId="896">
     <w:name w:val="toc 3"/>
-    <w:basedOn w:val="858"/>
-    <w:next w:val="858"/>
+    <w:basedOn w:val="859"/>
+    <w:next w:val="859"/>
     <w:uiPriority w:val="39"/>
     <w:unhideWhenUsed/>
     <w:pPr>
@@ -43632,10 +43716,10 @@
       <w:ind w:left="440"/>
     </w:pPr>
   </w:style>
-  <w:style w:type="paragraph" w:styleId="896">
+  <w:style w:type="paragraph" w:styleId="897">
     <w:name w:val="toc 4"/>
-    <w:basedOn w:val="858"/>
-    <w:next w:val="858"/>
+    <w:basedOn w:val="859"/>
+    <w:next w:val="859"/>
     <w:uiPriority w:val="39"/>
     <w:unhideWhenUsed/>
     <w:pPr>
@@ -43644,10 +43728,10 @@
       <w:ind w:left="660"/>
     </w:pPr>
   </w:style>
-  <w:style w:type="paragraph" w:styleId="897">
+  <w:style w:type="paragraph" w:styleId="898">
     <w:name w:val="toc 5"/>
-    <w:basedOn w:val="858"/>
-    <w:next w:val="858"/>
+    <w:basedOn w:val="859"/>
+    <w:next w:val="859"/>
     <w:uiPriority w:val="39"/>
     <w:unhideWhenUsed/>
     <w:pPr>
@@ -43656,10 +43740,10 @@
       <w:ind w:left="880"/>
     </w:pPr>
   </w:style>
-  <w:style w:type="paragraph" w:styleId="898">
+  <w:style w:type="paragraph" w:styleId="899">
     <w:name w:val="toc 6"/>
-    <w:basedOn w:val="858"/>
-    <w:next w:val="858"/>
+    <w:basedOn w:val="859"/>
+    <w:next w:val="859"/>
     <w:uiPriority w:val="39"/>
     <w:unhideWhenUsed/>
     <w:pPr>
@@ -43668,10 +43752,10 @@
       <w:ind w:left="1100"/>
     </w:pPr>
   </w:style>
-  <w:style w:type="paragraph" w:styleId="899">
+  <w:style w:type="paragraph" w:styleId="900">
     <w:name w:val="toc 7"/>
-    <w:basedOn w:val="858"/>
-    <w:next w:val="858"/>
+    <w:basedOn w:val="859"/>
+    <w:next w:val="859"/>
     <w:uiPriority w:val="39"/>
     <w:unhideWhenUsed/>
     <w:pPr>
@@ -43680,10 +43764,10 @@
       <w:ind w:left="1320"/>
     </w:pPr>
   </w:style>
-  <w:style w:type="paragraph" w:styleId="900">
+  <w:style w:type="paragraph" w:styleId="901">
     <w:name w:val="toc 8"/>
-    <w:basedOn w:val="858"/>
-    <w:next w:val="858"/>
+    <w:basedOn w:val="859"/>
+    <w:next w:val="859"/>
     <w:uiPriority w:val="39"/>
     <w:unhideWhenUsed/>
     <w:pPr>
@@ -43692,10 +43776,10 @@
       <w:ind w:left="1540"/>
     </w:pPr>
   </w:style>
-  <w:style w:type="paragraph" w:styleId="901">
+  <w:style w:type="paragraph" w:styleId="902">
     <w:name w:val="toc 9"/>
-    <w:basedOn w:val="858"/>
-    <w:next w:val="858"/>
+    <w:basedOn w:val="859"/>
+    <w:next w:val="859"/>
     <w:uiPriority w:val="39"/>
     <w:unhideWhenUsed/>
     <w:pPr>
@@ -43704,9 +43788,9 @@
       <w:ind w:left="1760"/>
     </w:pPr>
   </w:style>
-  <w:style w:type="character" w:styleId="902">
+  <w:style w:type="character" w:styleId="903">
     <w:name w:val="Placeholder Text"/>
-    <w:basedOn w:val="862"/>
+    <w:basedOn w:val="863"/>
     <w:uiPriority w:val="99"/>
     <w:semiHidden/>
     <w:pPr>
@@ -43718,7 +43802,7 @@
       <w:color w:val="666666"/>
     </w:rPr>
   </w:style>
-  <w:style w:type="paragraph" w:styleId="903">
+  <w:style w:type="paragraph" w:styleId="904">
     <w:name w:val="TOC Heading"/>
     <w:uiPriority w:val="39"/>
     <w:unhideWhenUsed/>
@@ -43728,10 +43812,10 @@
       <w:ind/>
     </w:pPr>
   </w:style>
-  <w:style w:type="paragraph" w:styleId="904">
+  <w:style w:type="paragraph" w:styleId="905">
     <w:name w:val="table of figures"/>
-    <w:basedOn w:val="858"/>
-    <w:next w:val="858"/>
+    <w:basedOn w:val="859"/>
+    <w:next w:val="859"/>
     <w:uiPriority w:val="99"/>
     <w:unhideWhenUsed/>
     <w:pPr>
@@ -43740,7 +43824,7 @@
       <w:ind/>
     </w:pPr>
   </w:style>
-  <w:style w:type="paragraph" w:styleId="905">
+  <w:style w:type="paragraph" w:styleId="906">
     <w:name w:val="Title"/>
     <w:qFormat/>
     <w:pPr>
@@ -43753,7 +43837,7 @@
       <w:szCs w:val="56"/>
     </w:rPr>
   </w:style>
-  <w:style w:type="paragraph" w:styleId="906">
+  <w:style w:type="paragraph" w:styleId="907">
     <w:name w:val="Heading 4"/>
     <w:qFormat/>
     <w:pPr>
@@ -43767,7 +43851,7 @@
       <w:color w:val="2e74b5"/>
     </w:rPr>
   </w:style>
-  <w:style w:type="paragraph" w:styleId="907">
+  <w:style w:type="paragraph" w:styleId="908">
     <w:name w:val="Heading 5"/>
     <w:qFormat/>
     <w:pPr>
@@ -43779,7 +43863,7 @@
       <w:color w:val="2e74b5"/>
     </w:rPr>
   </w:style>
-  <w:style w:type="paragraph" w:styleId="908">
+  <w:style w:type="paragraph" w:styleId="909">
     <w:name w:val="Heading 6"/>
     <w:qFormat/>
     <w:pPr>
@@ -43791,7 +43875,7 @@
       <w:color w:val="1f4d78"/>
     </w:rPr>
   </w:style>
-  <w:style w:type="paragraph" w:styleId="909">
+  <w:style w:type="paragraph" w:styleId="910">
     <w:name w:val="Strong"/>
     <w:qFormat/>
     <w:pPr>
@@ -43804,7 +43888,7 @@
       <w:bCs/>
     </w:rPr>
   </w:style>
-  <w:style w:type="paragraph" w:styleId="910">
+  <w:style w:type="paragraph" w:styleId="911">
     <w:name w:val="List Paragraph"/>
     <w:qFormat/>
     <w:pPr>
@@ -43813,7 +43897,7 @@
       <w:ind/>
     </w:pPr>
   </w:style>
-  <w:style w:type="character" w:styleId="911">
+  <w:style w:type="character" w:styleId="912">
     <w:name w:val="Hyperlink"/>
     <w:uiPriority w:val="99"/>
     <w:unhideWhenUsed/>
@@ -43827,7 +43911,7 @@
       <w:u w:val="single"/>
     </w:rPr>
   </w:style>
-  <w:style w:type="character" w:styleId="912">
+  <w:style w:type="character" w:styleId="913">
     <w:name w:val="footnote reference"/>
     <w:uiPriority w:val="99"/>
     <w:semiHidden/>
@@ -43841,9 +43925,9 @@
       <w:vertAlign w:val="superscript"/>
     </w:rPr>
   </w:style>
-  <w:style w:type="paragraph" w:styleId="913">
+  <w:style w:type="paragraph" w:styleId="914">
     <w:name w:val="footnote text"/>
-    <w:link w:val="914"/>
+    <w:link w:val="915"/>
     <w:uiPriority w:val="99"/>
     <w:semiHidden/>
     <w:unhideWhenUsed/>
@@ -43857,9 +43941,9 @@
       <w:szCs w:val="20"/>
     </w:rPr>
   </w:style>
-  <w:style w:type="character" w:styleId="914">
+  <w:style w:type="character" w:styleId="915">
     <w:name w:val="Footnote Text Char"/>
-    <w:link w:val="913"/>
+    <w:link w:val="914"/>
     <w:uiPriority w:val="99"/>
     <w:semiHidden/>
     <w:unhideWhenUsed/>
@@ -43873,7 +43957,7 @@
       <w:szCs w:val="20"/>
     </w:rPr>
   </w:style>
-  <w:style w:type="character" w:styleId="915">
+  <w:style w:type="character" w:styleId="916">
     <w:name w:val="endnote reference"/>
     <w:uiPriority w:val="99"/>
     <w:semiHidden/>
@@ -43887,9 +43971,9 @@
       <w:vertAlign w:val="superscript"/>
     </w:rPr>
   </w:style>
-  <w:style w:type="paragraph" w:styleId="916">
+  <w:style w:type="paragraph" w:styleId="917">
     <w:name w:val="endnote text"/>
-    <w:link w:val="917"/>
+    <w:link w:val="918"/>
     <w:uiPriority w:val="99"/>
     <w:semiHidden/>
     <w:unhideWhenUsed/>
@@ -43903,9 +43987,9 @@
       <w:szCs w:val="20"/>
     </w:rPr>
   </w:style>
-  <w:style w:type="character" w:styleId="917">
+  <w:style w:type="character" w:styleId="918">
     <w:name w:val="Endnote Text Char"/>
-    <w:link w:val="916"/>
+    <w:link w:val="917"/>
     <w:uiPriority w:val="99"/>
     <w:semiHidden/>
     <w:unhideWhenUsed/>
@@ -43919,7 +44003,7 @@
       <w:szCs w:val="20"/>
     </w:rPr>
   </w:style>
-  <w:style w:type="paragraph" w:styleId="918">
+  <w:style w:type="paragraph" w:styleId="919">
     <w:name w:val="Heading 1"/>
     <w:qFormat/>
     <w:pPr>
@@ -43939,7 +44023,7 @@
       <w:szCs w:val="36"/>
     </w:rPr>
   </w:style>
-  <w:style w:type="paragraph" w:styleId="919">
+  <w:style w:type="paragraph" w:styleId="920">
     <w:name w:val="Heading 2"/>
     <w:qFormat/>
     <w:pPr>
@@ -43957,7 +44041,7 @@
       <w:szCs w:val="28"/>
     </w:rPr>
   </w:style>
-  <w:style w:type="paragraph" w:styleId="920">
+  <w:style w:type="paragraph" w:styleId="921">
     <w:name w:val="Heading 3"/>
     <w:qFormat/>
     <w:pPr>

</xml_diff>